<commit_message>
minor changes to the report
</commit_message>
<xml_diff>
--- a/Lab3/Лаб3_ООП_ГусакМикола_ІМ54.docx
+++ b/Lab3/Лаб3_ООП_ГусакМикола_ІМ54.docx
@@ -190,7 +190,7 @@
           <w:sz w:val="28"/>
           <w:shd w:fill="auto" w:val="clear"/>
         </w:rPr>
-        <w:t>4</w:t>
+        <w:t>3</w:t>
       </w:r>
     </w:p>
     <w:p>
@@ -1402,6 +1402,23 @@
       </w:pPr>
       <w:r>
         <w:rPr>
+          <w:color w:val="000000"/>
+        </w:rPr>
+      </w:r>
+    </w:p>
+    <w:p>
+      <w:pPr>
+        <w:pStyle w:val="Normal"/>
+        <w:bidi w:val="0"/>
+        <w:spacing w:lineRule="exact" w:line="259" w:before="0" w:after="160"/>
+        <w:ind w:hanging="0" w:left="0" w:right="0"/>
+        <w:jc w:val="left"/>
+        <w:rPr>
+          <w:color w:val="000000"/>
+        </w:rPr>
+      </w:pPr>
+      <w:r>
+        <w:rPr>
           <w:rFonts w:ascii="Times New Roman" w:hAnsi="Times New Roman"/>
           <w:b w:val="false"/>
           <w:bCs w:val="false"/>
@@ -1411,6 +1428,7 @@
           <w:u w:val="none"/>
           <w:lang w:val="en-US"/>
         </w:rPr>
+        <w:t>MainWindow::MainWindow(QWidget* parent)</w:t>
       </w:r>
     </w:p>
     <w:p>
@@ -1435,7 +1453,20 @@
           <w:u w:val="none"/>
           <w:lang w:val="en-US"/>
         </w:rPr>
-        <w:t>MainWindow::MainWindow(QWidget* parent)</w:t>
+        <w:t xml:space="preserve">    </w:t>
+      </w:r>
+      <w:r>
+        <w:rPr>
+          <w:rFonts w:ascii="Times New Roman" w:hAnsi="Times New Roman"/>
+          <w:b w:val="false"/>
+          <w:bCs w:val="false"/>
+          <w:color w:val="000000"/>
+          <w:sz w:val="24"/>
+          <w:szCs w:val="24"/>
+          <w:u w:val="none"/>
+          <w:lang w:val="en-US"/>
+        </w:rPr>
+        <w:t>: QMainWindow(parent)</w:t>
       </w:r>
     </w:p>
     <w:p>
@@ -1473,7 +1504,7 @@
           <w:u w:val="none"/>
           <w:lang w:val="en-US"/>
         </w:rPr>
-        <w:t>: QMainWindow(parent)</w:t>
+        <w:t>, ui(new Ui::MainWindow)</w:t>
       </w:r>
     </w:p>
     <w:p>
@@ -1498,8 +1529,20 @@
           <w:u w:val="none"/>
           <w:lang w:val="en-US"/>
         </w:rPr>
-        <w:t xml:space="preserve">    </w:t>
-      </w:r>
+        <w:t>{</w:t>
+      </w:r>
+    </w:p>
+    <w:p>
+      <w:pPr>
+        <w:pStyle w:val="Normal"/>
+        <w:bidi w:val="0"/>
+        <w:spacing w:lineRule="exact" w:line="259" w:before="0" w:after="160"/>
+        <w:ind w:hanging="0" w:left="0" w:right="0"/>
+        <w:jc w:val="left"/>
+        <w:rPr>
+          <w:color w:val="000000"/>
+        </w:rPr>
+      </w:pPr>
       <w:r>
         <w:rPr>
           <w:rFonts w:ascii="Times New Roman" w:hAnsi="Times New Roman"/>
@@ -1511,7 +1554,20 @@
           <w:u w:val="none"/>
           <w:lang w:val="en-US"/>
         </w:rPr>
-        <w:t>, ui(new Ui::MainWindow)</w:t>
+        <w:t xml:space="preserve">    </w:t>
+      </w:r>
+      <w:r>
+        <w:rPr>
+          <w:rFonts w:ascii="Times New Roman" w:hAnsi="Times New Roman"/>
+          <w:b w:val="false"/>
+          <w:bCs w:val="false"/>
+          <w:color w:val="000000"/>
+          <w:sz w:val="24"/>
+          <w:szCs w:val="24"/>
+          <w:u w:val="none"/>
+          <w:lang w:val="en-US"/>
+        </w:rPr>
+        <w:t>ui→setupUi(this);</w:t>
       </w:r>
     </w:p>
     <w:p>
@@ -1536,6 +1592,930 @@
           <w:u w:val="none"/>
           <w:lang w:val="en-US"/>
         </w:rPr>
+        <w:t xml:space="preserve">    </w:t>
+      </w:r>
+      <w:r>
+        <w:rPr>
+          <w:rFonts w:ascii="Times New Roman" w:hAnsi="Times New Roman"/>
+          <w:b w:val="false"/>
+          <w:bCs w:val="false"/>
+          <w:color w:val="000000"/>
+          <w:sz w:val="24"/>
+          <w:szCs w:val="24"/>
+          <w:u w:val="none"/>
+          <w:lang w:val="en-US"/>
+        </w:rPr>
+        <w:t>ui-&gt;toolBar-&gt;setIconSize(QSize(20, 20));</w:t>
+      </w:r>
+    </w:p>
+    <w:p>
+      <w:pPr>
+        <w:pStyle w:val="Normal"/>
+        <w:bidi w:val="0"/>
+        <w:spacing w:lineRule="exact" w:line="259" w:before="0" w:after="160"/>
+        <w:ind w:hanging="0" w:left="0" w:right="0"/>
+        <w:jc w:val="left"/>
+        <w:rPr>
+          <w:color w:val="000000"/>
+        </w:rPr>
+      </w:pPr>
+      <w:r>
+        <w:rPr>
+          <w:rFonts w:ascii="Times New Roman" w:hAnsi="Times New Roman"/>
+          <w:b w:val="false"/>
+          <w:bCs w:val="false"/>
+          <w:color w:val="000000"/>
+          <w:sz w:val="24"/>
+          <w:szCs w:val="24"/>
+          <w:u w:val="none"/>
+          <w:lang w:val="en-US"/>
+        </w:rPr>
+        <w:t xml:space="preserve">    </w:t>
+      </w:r>
+      <w:r>
+        <w:rPr>
+          <w:rFonts w:ascii="Times New Roman" w:hAnsi="Times New Roman"/>
+          <w:b w:val="false"/>
+          <w:bCs w:val="false"/>
+          <w:color w:val="000000"/>
+          <w:sz w:val="24"/>
+          <w:szCs w:val="24"/>
+          <w:u w:val="none"/>
+          <w:lang w:val="en-US"/>
+        </w:rPr>
+        <w:t>ui-&gt;line-&gt;setIcon(QIcon(":/icons/line.svg"));</w:t>
+      </w:r>
+    </w:p>
+    <w:p>
+      <w:pPr>
+        <w:pStyle w:val="Normal"/>
+        <w:bidi w:val="0"/>
+        <w:spacing w:lineRule="exact" w:line="259" w:before="0" w:after="160"/>
+        <w:ind w:hanging="0" w:left="0" w:right="0"/>
+        <w:jc w:val="left"/>
+        <w:rPr>
+          <w:color w:val="000000"/>
+        </w:rPr>
+      </w:pPr>
+      <w:r>
+        <w:rPr>
+          <w:rFonts w:ascii="Times New Roman" w:hAnsi="Times New Roman"/>
+          <w:b w:val="false"/>
+          <w:bCs w:val="false"/>
+          <w:color w:val="000000"/>
+          <w:sz w:val="24"/>
+          <w:szCs w:val="24"/>
+          <w:u w:val="none"/>
+          <w:lang w:val="en-US"/>
+        </w:rPr>
+        <w:t xml:space="preserve">    </w:t>
+      </w:r>
+      <w:r>
+        <w:rPr>
+          <w:rFonts w:ascii="Times New Roman" w:hAnsi="Times New Roman"/>
+          <w:b w:val="false"/>
+          <w:bCs w:val="false"/>
+          <w:color w:val="000000"/>
+          <w:sz w:val="24"/>
+          <w:szCs w:val="24"/>
+          <w:u w:val="none"/>
+          <w:lang w:val="en-US"/>
+        </w:rPr>
+        <w:t>ui-&gt;rectangle-&gt;setIcon(QIcon(":/icons/rectangle.svg"));</w:t>
+      </w:r>
+    </w:p>
+    <w:p>
+      <w:pPr>
+        <w:pStyle w:val="Normal"/>
+        <w:bidi w:val="0"/>
+        <w:spacing w:lineRule="exact" w:line="259" w:before="0" w:after="160"/>
+        <w:ind w:hanging="0" w:left="0" w:right="0"/>
+        <w:jc w:val="left"/>
+        <w:rPr>
+          <w:color w:val="000000"/>
+        </w:rPr>
+      </w:pPr>
+      <w:r>
+        <w:rPr>
+          <w:rFonts w:ascii="Times New Roman" w:hAnsi="Times New Roman"/>
+          <w:b w:val="false"/>
+          <w:bCs w:val="false"/>
+          <w:color w:val="000000"/>
+          <w:sz w:val="24"/>
+          <w:szCs w:val="24"/>
+          <w:u w:val="none"/>
+          <w:lang w:val="en-US"/>
+        </w:rPr>
+        <w:t xml:space="preserve">    </w:t>
+      </w:r>
+      <w:r>
+        <w:rPr>
+          <w:rFonts w:ascii="Times New Roman" w:hAnsi="Times New Roman"/>
+          <w:b w:val="false"/>
+          <w:bCs w:val="false"/>
+          <w:color w:val="000000"/>
+          <w:sz w:val="24"/>
+          <w:szCs w:val="24"/>
+          <w:u w:val="none"/>
+          <w:lang w:val="en-US"/>
+        </w:rPr>
+        <w:t>ui-&gt;ellipse-&gt;setIcon(QIcon(":/icons/ellipse.svg"));</w:t>
+      </w:r>
+    </w:p>
+    <w:p>
+      <w:pPr>
+        <w:pStyle w:val="Normal"/>
+        <w:bidi w:val="0"/>
+        <w:spacing w:lineRule="exact" w:line="259" w:before="0" w:after="160"/>
+        <w:ind w:hanging="0" w:left="0" w:right="0"/>
+        <w:jc w:val="left"/>
+        <w:rPr>
+          <w:color w:val="000000"/>
+        </w:rPr>
+      </w:pPr>
+      <w:r>
+        <w:rPr>
+          <w:rFonts w:ascii="Times New Roman" w:hAnsi="Times New Roman"/>
+          <w:b w:val="false"/>
+          <w:bCs w:val="false"/>
+          <w:color w:val="000000"/>
+          <w:sz w:val="24"/>
+          <w:szCs w:val="24"/>
+          <w:u w:val="none"/>
+          <w:lang w:val="en-US"/>
+        </w:rPr>
+        <w:t xml:space="preserve">    </w:t>
+      </w:r>
+      <w:r>
+        <w:rPr>
+          <w:rFonts w:ascii="Times New Roman" w:hAnsi="Times New Roman"/>
+          <w:b w:val="false"/>
+          <w:bCs w:val="false"/>
+          <w:color w:val="000000"/>
+          <w:sz w:val="24"/>
+          <w:szCs w:val="24"/>
+          <w:u w:val="none"/>
+          <w:lang w:val="en-US"/>
+        </w:rPr>
+        <w:t>ui-&gt;point-&gt;setIcon(QIcon(":/icons/point.svg"));</w:t>
+      </w:r>
+    </w:p>
+    <w:p>
+      <w:pPr>
+        <w:pStyle w:val="Normal"/>
+        <w:bidi w:val="0"/>
+        <w:spacing w:lineRule="exact" w:line="259" w:before="0" w:after="160"/>
+        <w:ind w:hanging="0" w:left="0" w:right="0"/>
+        <w:jc w:val="left"/>
+        <w:rPr>
+          <w:color w:val="000000"/>
+        </w:rPr>
+      </w:pPr>
+      <w:r>
+        <w:rPr>
+          <w:rFonts w:ascii="Times New Roman" w:hAnsi="Times New Roman"/>
+          <w:b w:val="false"/>
+          <w:bCs w:val="false"/>
+          <w:color w:val="000000"/>
+          <w:sz w:val="24"/>
+          <w:szCs w:val="24"/>
+          <w:u w:val="none"/>
+          <w:lang w:val="en-US"/>
+        </w:rPr>
+        <w:t xml:space="preserve">    </w:t>
+      </w:r>
+      <w:r>
+        <w:rPr>
+          <w:rFonts w:ascii="Times New Roman" w:hAnsi="Times New Roman"/>
+          <w:b w:val="false"/>
+          <w:bCs w:val="false"/>
+          <w:color w:val="000000"/>
+          <w:sz w:val="24"/>
+          <w:szCs w:val="24"/>
+          <w:u w:val="none"/>
+          <w:lang w:val="en-US"/>
+        </w:rPr>
+        <w:t>ui-&gt;back-&gt;setIcon(QIcon(":/icons/back.svg"));</w:t>
+      </w:r>
+    </w:p>
+    <w:p>
+      <w:pPr>
+        <w:pStyle w:val="Normal"/>
+        <w:bidi w:val="0"/>
+        <w:spacing w:lineRule="exact" w:line="259" w:before="0" w:after="160"/>
+        <w:ind w:hanging="0" w:left="0" w:right="0"/>
+        <w:jc w:val="left"/>
+        <w:rPr>
+          <w:color w:val="000000"/>
+        </w:rPr>
+      </w:pPr>
+      <w:r>
+        <w:rPr>
+          <w:rFonts w:ascii="Times New Roman" w:hAnsi="Times New Roman"/>
+          <w:b w:val="false"/>
+          <w:bCs w:val="false"/>
+          <w:color w:val="000000"/>
+          <w:sz w:val="24"/>
+          <w:szCs w:val="24"/>
+          <w:u w:val="none"/>
+          <w:lang w:val="en-US"/>
+        </w:rPr>
+        <w:t xml:space="preserve">    </w:t>
+      </w:r>
+      <w:r>
+        <w:rPr>
+          <w:rFonts w:ascii="Times New Roman" w:hAnsi="Times New Roman"/>
+          <w:b w:val="false"/>
+          <w:bCs w:val="false"/>
+          <w:color w:val="000000"/>
+          <w:sz w:val="24"/>
+          <w:szCs w:val="24"/>
+          <w:u w:val="none"/>
+          <w:lang w:val="en-US"/>
+        </w:rPr>
+        <w:t>ui-&gt;color-&gt;setIcon(QIcon(":/icons/colorpalette.svg"));</w:t>
+      </w:r>
+    </w:p>
+    <w:p>
+      <w:pPr>
+        <w:pStyle w:val="Normal"/>
+        <w:bidi w:val="0"/>
+        <w:spacing w:lineRule="exact" w:line="259" w:before="0" w:after="160"/>
+        <w:ind w:hanging="0" w:left="0" w:right="0"/>
+        <w:jc w:val="left"/>
+        <w:rPr>
+          <w:color w:val="000000"/>
+        </w:rPr>
+      </w:pPr>
+      <w:r>
+        <w:rPr>
+          <w:rFonts w:ascii="Times New Roman" w:hAnsi="Times New Roman"/>
+          <w:b w:val="false"/>
+          <w:bCs w:val="false"/>
+          <w:color w:val="000000"/>
+          <w:sz w:val="24"/>
+          <w:szCs w:val="24"/>
+          <w:u w:val="none"/>
+          <w:lang w:val="en-US"/>
+        </w:rPr>
+        <w:t xml:space="preserve">    </w:t>
+      </w:r>
+    </w:p>
+    <w:p>
+      <w:pPr>
+        <w:pStyle w:val="Normal"/>
+        <w:bidi w:val="0"/>
+        <w:spacing w:lineRule="exact" w:line="259" w:before="0" w:after="160"/>
+        <w:ind w:hanging="0" w:left="0" w:right="0"/>
+        <w:jc w:val="left"/>
+        <w:rPr>
+          <w:color w:val="000000"/>
+        </w:rPr>
+      </w:pPr>
+      <w:r>
+        <w:rPr>
+          <w:rFonts w:ascii="Times New Roman" w:hAnsi="Times New Roman"/>
+          <w:b w:val="false"/>
+          <w:bCs w:val="false"/>
+          <w:color w:val="000000"/>
+          <w:sz w:val="24"/>
+          <w:szCs w:val="24"/>
+          <w:u w:val="none"/>
+          <w:lang w:val="en-US"/>
+        </w:rPr>
+        <w:t xml:space="preserve">    </w:t>
+      </w:r>
+      <w:r>
+        <w:rPr>
+          <w:rFonts w:ascii="Times New Roman" w:hAnsi="Times New Roman"/>
+          <w:b w:val="false"/>
+          <w:bCs w:val="false"/>
+          <w:color w:val="000000"/>
+          <w:sz w:val="24"/>
+          <w:szCs w:val="24"/>
+          <w:u w:val="none"/>
+          <w:lang w:val="en-US"/>
+        </w:rPr>
+        <w:t>ui-&gt;toolBar-&gt;setToolButtonStyle(Qt::ToolButtonIconOnly);</w:t>
+      </w:r>
+    </w:p>
+    <w:p>
+      <w:pPr>
+        <w:pStyle w:val="Normal"/>
+        <w:bidi w:val="0"/>
+        <w:spacing w:lineRule="exact" w:line="259" w:before="0" w:after="160"/>
+        <w:ind w:hanging="0" w:left="0" w:right="0"/>
+        <w:jc w:val="left"/>
+        <w:rPr>
+          <w:color w:val="000000"/>
+        </w:rPr>
+      </w:pPr>
+      <w:r>
+        <w:rPr>
+          <w:rFonts w:ascii="Times New Roman" w:hAnsi="Times New Roman"/>
+          <w:b w:val="false"/>
+          <w:bCs w:val="false"/>
+          <w:color w:val="000000"/>
+          <w:sz w:val="24"/>
+          <w:szCs w:val="24"/>
+          <w:u w:val="none"/>
+          <w:lang w:val="en-US"/>
+        </w:rPr>
+        <w:t xml:space="preserve">    </w:t>
+      </w:r>
+      <w:r>
+        <w:rPr>
+          <w:rFonts w:ascii="Times New Roman" w:hAnsi="Times New Roman"/>
+          <w:b w:val="false"/>
+          <w:bCs w:val="false"/>
+          <w:color w:val="000000"/>
+          <w:sz w:val="24"/>
+          <w:szCs w:val="24"/>
+          <w:u w:val="none"/>
+          <w:lang w:val="en-US"/>
+        </w:rPr>
+        <w:t>manager = new ShapeObjectsEditor();</w:t>
+      </w:r>
+    </w:p>
+    <w:p>
+      <w:pPr>
+        <w:pStyle w:val="Normal"/>
+        <w:bidi w:val="0"/>
+        <w:spacing w:lineRule="exact" w:line="259" w:before="0" w:after="160"/>
+        <w:ind w:hanging="0" w:left="0" w:right="0"/>
+        <w:jc w:val="left"/>
+        <w:rPr>
+          <w:color w:val="000000"/>
+        </w:rPr>
+      </w:pPr>
+      <w:r>
+        <w:rPr>
+          <w:rFonts w:ascii="Times New Roman" w:hAnsi="Times New Roman"/>
+          <w:b w:val="false"/>
+          <w:bCs w:val="false"/>
+          <w:color w:val="000000"/>
+          <w:sz w:val="24"/>
+          <w:szCs w:val="24"/>
+          <w:u w:val="none"/>
+          <w:lang w:val="en-US"/>
+        </w:rPr>
+        <w:t xml:space="preserve">    </w:t>
+      </w:r>
+      <w:r>
+        <w:rPr>
+          <w:rFonts w:ascii="Times New Roman" w:hAnsi="Times New Roman"/>
+          <w:b w:val="false"/>
+          <w:bCs w:val="false"/>
+          <w:color w:val="000000"/>
+          <w:sz w:val="24"/>
+          <w:szCs w:val="24"/>
+          <w:u w:val="none"/>
+          <w:lang w:val="en-US"/>
+        </w:rPr>
+        <w:t>manager-&gt;StartLineEditor();</w:t>
+      </w:r>
+    </w:p>
+    <w:p>
+      <w:pPr>
+        <w:pStyle w:val="Normal"/>
+        <w:bidi w:val="0"/>
+        <w:spacing w:lineRule="exact" w:line="259" w:before="0" w:after="160"/>
+        <w:ind w:hanging="0" w:left="0" w:right="0"/>
+        <w:jc w:val="left"/>
+        <w:rPr>
+          <w:color w:val="000000"/>
+        </w:rPr>
+      </w:pPr>
+      <w:r>
+        <w:rPr>
+          <w:rFonts w:ascii="Times New Roman" w:hAnsi="Times New Roman"/>
+          <w:b w:val="false"/>
+          <w:bCs w:val="false"/>
+          <w:color w:val="000000"/>
+          <w:sz w:val="24"/>
+          <w:szCs w:val="24"/>
+          <w:u w:val="none"/>
+          <w:lang w:val="en-US"/>
+        </w:rPr>
+        <w:t xml:space="preserve">    </w:t>
+      </w:r>
+      <w:r>
+        <w:rPr>
+          <w:rFonts w:ascii="Times New Roman" w:hAnsi="Times New Roman"/>
+          <w:b w:val="false"/>
+          <w:bCs w:val="false"/>
+          <w:color w:val="000000"/>
+          <w:sz w:val="24"/>
+          <w:szCs w:val="24"/>
+          <w:u w:val="none"/>
+          <w:lang w:val="en-US"/>
+        </w:rPr>
+        <w:t>this-&gt;setWindowTitle("Поточний об'єкт: Лінія");</w:t>
+      </w:r>
+    </w:p>
+    <w:p>
+      <w:pPr>
+        <w:pStyle w:val="Normal"/>
+        <w:bidi w:val="0"/>
+        <w:spacing w:lineRule="exact" w:line="259" w:before="0" w:after="160"/>
+        <w:ind w:hanging="0" w:left="0" w:right="0"/>
+        <w:jc w:val="left"/>
+        <w:rPr>
+          <w:color w:val="000000"/>
+        </w:rPr>
+      </w:pPr>
+      <w:r>
+        <w:rPr>
+          <w:color w:val="000000"/>
+        </w:rPr>
+      </w:r>
+    </w:p>
+    <w:p>
+      <w:pPr>
+        <w:pStyle w:val="Normal"/>
+        <w:bidi w:val="0"/>
+        <w:spacing w:lineRule="exact" w:line="259" w:before="0" w:after="160"/>
+        <w:ind w:hanging="0" w:left="0" w:right="0"/>
+        <w:jc w:val="left"/>
+        <w:rPr>
+          <w:color w:val="000000"/>
+        </w:rPr>
+      </w:pPr>
+      <w:r>
+        <w:rPr>
+          <w:rFonts w:ascii="Times New Roman" w:hAnsi="Times New Roman"/>
+          <w:b w:val="false"/>
+          <w:bCs w:val="false"/>
+          <w:color w:val="000000"/>
+          <w:sz w:val="24"/>
+          <w:szCs w:val="24"/>
+          <w:u w:val="none"/>
+          <w:lang w:val="en-US"/>
+        </w:rPr>
+        <w:t xml:space="preserve">    </w:t>
+      </w:r>
+      <w:r>
+        <w:rPr>
+          <w:rFonts w:ascii="Times New Roman" w:hAnsi="Times New Roman"/>
+          <w:b w:val="false"/>
+          <w:bCs w:val="false"/>
+          <w:color w:val="000000"/>
+          <w:sz w:val="24"/>
+          <w:szCs w:val="24"/>
+          <w:u w:val="none"/>
+          <w:lang w:val="en-US"/>
+        </w:rPr>
+        <w:t>MainWidget* widget = new MainWidget(manager, this);</w:t>
+      </w:r>
+    </w:p>
+    <w:p>
+      <w:pPr>
+        <w:pStyle w:val="Normal"/>
+        <w:bidi w:val="0"/>
+        <w:spacing w:lineRule="exact" w:line="259" w:before="0" w:after="160"/>
+        <w:ind w:hanging="0" w:left="0" w:right="0"/>
+        <w:jc w:val="left"/>
+        <w:rPr>
+          <w:color w:val="000000"/>
+        </w:rPr>
+      </w:pPr>
+      <w:r>
+        <w:rPr>
+          <w:rFonts w:ascii="Times New Roman" w:hAnsi="Times New Roman"/>
+          <w:b w:val="false"/>
+          <w:bCs w:val="false"/>
+          <w:color w:val="000000"/>
+          <w:sz w:val="24"/>
+          <w:szCs w:val="24"/>
+          <w:u w:val="none"/>
+          <w:lang w:val="en-US"/>
+        </w:rPr>
+        <w:t xml:space="preserve">    </w:t>
+      </w:r>
+      <w:r>
+        <w:rPr>
+          <w:rFonts w:ascii="Times New Roman" w:hAnsi="Times New Roman"/>
+          <w:b w:val="false"/>
+          <w:bCs w:val="false"/>
+          <w:color w:val="000000"/>
+          <w:sz w:val="24"/>
+          <w:szCs w:val="24"/>
+          <w:u w:val="none"/>
+          <w:lang w:val="en-US"/>
+        </w:rPr>
+        <w:t>widget-&gt;setMouseTracking(true);</w:t>
+      </w:r>
+    </w:p>
+    <w:p>
+      <w:pPr>
+        <w:pStyle w:val="Normal"/>
+        <w:bidi w:val="0"/>
+        <w:spacing w:lineRule="exact" w:line="259" w:before="0" w:after="160"/>
+        <w:ind w:hanging="0" w:left="0" w:right="0"/>
+        <w:jc w:val="left"/>
+        <w:rPr>
+          <w:color w:val="000000"/>
+        </w:rPr>
+      </w:pPr>
+      <w:r>
+        <w:rPr>
+          <w:rFonts w:ascii="Times New Roman" w:hAnsi="Times New Roman"/>
+          <w:b w:val="false"/>
+          <w:bCs w:val="false"/>
+          <w:color w:val="000000"/>
+          <w:sz w:val="24"/>
+          <w:szCs w:val="24"/>
+          <w:u w:val="none"/>
+          <w:lang w:val="en-US"/>
+        </w:rPr>
+        <w:t xml:space="preserve">    </w:t>
+      </w:r>
+      <w:r>
+        <w:rPr>
+          <w:rFonts w:ascii="Times New Roman" w:hAnsi="Times New Roman"/>
+          <w:b w:val="false"/>
+          <w:bCs w:val="false"/>
+          <w:color w:val="000000"/>
+          <w:sz w:val="24"/>
+          <w:szCs w:val="24"/>
+          <w:u w:val="none"/>
+          <w:lang w:val="en-US"/>
+        </w:rPr>
+        <w:t>this-&gt;setCentralWidget(widget);</w:t>
+      </w:r>
+    </w:p>
+    <w:p>
+      <w:pPr>
+        <w:pStyle w:val="Normal"/>
+        <w:bidi w:val="0"/>
+        <w:spacing w:lineRule="exact" w:line="259" w:before="0" w:after="160"/>
+        <w:ind w:hanging="0" w:left="0" w:right="0"/>
+        <w:jc w:val="left"/>
+        <w:rPr>
+          <w:color w:val="000000"/>
+        </w:rPr>
+      </w:pPr>
+      <w:r>
+        <w:rPr>
+          <w:color w:val="000000"/>
+        </w:rPr>
+      </w:r>
+    </w:p>
+    <w:p>
+      <w:pPr>
+        <w:pStyle w:val="Normal"/>
+        <w:bidi w:val="0"/>
+        <w:spacing w:lineRule="exact" w:line="259" w:before="0" w:after="160"/>
+        <w:ind w:hanging="0" w:left="0" w:right="0"/>
+        <w:jc w:val="left"/>
+        <w:rPr>
+          <w:color w:val="000000"/>
+        </w:rPr>
+      </w:pPr>
+      <w:r>
+        <w:rPr>
+          <w:rFonts w:ascii="Times New Roman" w:hAnsi="Times New Roman"/>
+          <w:b w:val="false"/>
+          <w:bCs w:val="false"/>
+          <w:color w:val="000000"/>
+          <w:sz w:val="24"/>
+          <w:szCs w:val="24"/>
+          <w:u w:val="none"/>
+          <w:lang w:val="en-US"/>
+        </w:rPr>
+        <w:t xml:space="preserve">    </w:t>
+      </w:r>
+      <w:r>
+        <w:rPr>
+          <w:rFonts w:ascii="Times New Roman" w:hAnsi="Times New Roman"/>
+          <w:b w:val="false"/>
+          <w:bCs w:val="false"/>
+          <w:color w:val="000000"/>
+          <w:sz w:val="24"/>
+          <w:szCs w:val="24"/>
+          <w:u w:val="none"/>
+          <w:lang w:val="en-US"/>
+        </w:rPr>
+        <w:t>QActionGroup* toolsGroup = new QActionGroup(this);</w:t>
+      </w:r>
+    </w:p>
+    <w:p>
+      <w:pPr>
+        <w:pStyle w:val="Normal"/>
+        <w:bidi w:val="0"/>
+        <w:spacing w:lineRule="exact" w:line="259" w:before="0" w:after="160"/>
+        <w:ind w:hanging="0" w:left="0" w:right="0"/>
+        <w:jc w:val="left"/>
+        <w:rPr>
+          <w:color w:val="000000"/>
+        </w:rPr>
+      </w:pPr>
+      <w:r>
+        <w:rPr>
+          <w:rFonts w:ascii="Times New Roman" w:hAnsi="Times New Roman"/>
+          <w:b w:val="false"/>
+          <w:bCs w:val="false"/>
+          <w:color w:val="000000"/>
+          <w:sz w:val="24"/>
+          <w:szCs w:val="24"/>
+          <w:u w:val="none"/>
+          <w:lang w:val="en-US"/>
+        </w:rPr>
+        <w:t xml:space="preserve">    </w:t>
+      </w:r>
+      <w:r>
+        <w:rPr>
+          <w:rFonts w:ascii="Times New Roman" w:hAnsi="Times New Roman"/>
+          <w:b w:val="false"/>
+          <w:bCs w:val="false"/>
+          <w:color w:val="000000"/>
+          <w:sz w:val="24"/>
+          <w:szCs w:val="24"/>
+          <w:u w:val="none"/>
+          <w:lang w:val="en-US"/>
+        </w:rPr>
+        <w:t>toolsGroup-&gt;setExclusive(true);</w:t>
+      </w:r>
+    </w:p>
+    <w:p>
+      <w:pPr>
+        <w:pStyle w:val="Normal"/>
+        <w:bidi w:val="0"/>
+        <w:spacing w:lineRule="exact" w:line="259" w:before="0" w:after="160"/>
+        <w:ind w:hanging="0" w:left="0" w:right="0"/>
+        <w:jc w:val="left"/>
+        <w:rPr>
+          <w:color w:val="000000"/>
+        </w:rPr>
+      </w:pPr>
+      <w:r>
+        <w:rPr>
+          <w:rFonts w:ascii="Times New Roman" w:hAnsi="Times New Roman"/>
+          <w:b w:val="false"/>
+          <w:bCs w:val="false"/>
+          <w:color w:val="000000"/>
+          <w:sz w:val="24"/>
+          <w:szCs w:val="24"/>
+          <w:u w:val="none"/>
+          <w:lang w:val="en-US"/>
+        </w:rPr>
+        <w:t xml:space="preserve">    </w:t>
+      </w:r>
+      <w:r>
+        <w:rPr>
+          <w:rFonts w:ascii="Times New Roman" w:hAnsi="Times New Roman"/>
+          <w:b w:val="false"/>
+          <w:bCs w:val="false"/>
+          <w:color w:val="000000"/>
+          <w:sz w:val="24"/>
+          <w:szCs w:val="24"/>
+          <w:u w:val="none"/>
+          <w:lang w:val="en-US"/>
+        </w:rPr>
+        <w:t>toolsGroup-&gt;addAction(ui-&gt;ellipse);</w:t>
+      </w:r>
+    </w:p>
+    <w:p>
+      <w:pPr>
+        <w:pStyle w:val="Normal"/>
+        <w:bidi w:val="0"/>
+        <w:spacing w:lineRule="exact" w:line="259" w:before="0" w:after="160"/>
+        <w:ind w:hanging="0" w:left="0" w:right="0"/>
+        <w:jc w:val="left"/>
+        <w:rPr>
+          <w:color w:val="000000"/>
+        </w:rPr>
+      </w:pPr>
+      <w:r>
+        <w:rPr>
+          <w:rFonts w:ascii="Times New Roman" w:hAnsi="Times New Roman"/>
+          <w:b w:val="false"/>
+          <w:bCs w:val="false"/>
+          <w:color w:val="000000"/>
+          <w:sz w:val="24"/>
+          <w:szCs w:val="24"/>
+          <w:u w:val="none"/>
+          <w:lang w:val="en-US"/>
+        </w:rPr>
+        <w:t xml:space="preserve">    </w:t>
+      </w:r>
+      <w:r>
+        <w:rPr>
+          <w:rFonts w:ascii="Times New Roman" w:hAnsi="Times New Roman"/>
+          <w:b w:val="false"/>
+          <w:bCs w:val="false"/>
+          <w:color w:val="000000"/>
+          <w:sz w:val="24"/>
+          <w:szCs w:val="24"/>
+          <w:u w:val="none"/>
+          <w:lang w:val="en-US"/>
+        </w:rPr>
+        <w:t>toolsGroup-&gt;addAction(ui-&gt;line);</w:t>
+      </w:r>
+    </w:p>
+    <w:p>
+      <w:pPr>
+        <w:pStyle w:val="Normal"/>
+        <w:bidi w:val="0"/>
+        <w:spacing w:lineRule="exact" w:line="259" w:before="0" w:after="160"/>
+        <w:ind w:hanging="0" w:left="0" w:right="0"/>
+        <w:jc w:val="left"/>
+        <w:rPr>
+          <w:color w:val="000000"/>
+        </w:rPr>
+      </w:pPr>
+      <w:r>
+        <w:rPr>
+          <w:rFonts w:ascii="Times New Roman" w:hAnsi="Times New Roman"/>
+          <w:b w:val="false"/>
+          <w:bCs w:val="false"/>
+          <w:color w:val="000000"/>
+          <w:sz w:val="24"/>
+          <w:szCs w:val="24"/>
+          <w:u w:val="none"/>
+          <w:lang w:val="en-US"/>
+        </w:rPr>
+        <w:t xml:space="preserve">    </w:t>
+      </w:r>
+      <w:r>
+        <w:rPr>
+          <w:rFonts w:ascii="Times New Roman" w:hAnsi="Times New Roman"/>
+          <w:b w:val="false"/>
+          <w:bCs w:val="false"/>
+          <w:color w:val="000000"/>
+          <w:sz w:val="24"/>
+          <w:szCs w:val="24"/>
+          <w:u w:val="none"/>
+          <w:lang w:val="en-US"/>
+        </w:rPr>
+        <w:t>toolsGroup-&gt;addAction(ui-&gt;point);</w:t>
+      </w:r>
+    </w:p>
+    <w:p>
+      <w:pPr>
+        <w:pStyle w:val="Normal"/>
+        <w:bidi w:val="0"/>
+        <w:spacing w:lineRule="exact" w:line="259" w:before="0" w:after="160"/>
+        <w:ind w:hanging="0" w:left="0" w:right="0"/>
+        <w:jc w:val="left"/>
+        <w:rPr>
+          <w:color w:val="000000"/>
+        </w:rPr>
+      </w:pPr>
+      <w:r>
+        <w:rPr>
+          <w:rFonts w:ascii="Times New Roman" w:hAnsi="Times New Roman"/>
+          <w:b w:val="false"/>
+          <w:bCs w:val="false"/>
+          <w:color w:val="000000"/>
+          <w:sz w:val="24"/>
+          <w:szCs w:val="24"/>
+          <w:u w:val="none"/>
+          <w:lang w:val="en-US"/>
+        </w:rPr>
+        <w:t xml:space="preserve">    </w:t>
+      </w:r>
+      <w:r>
+        <w:rPr>
+          <w:rFonts w:ascii="Times New Roman" w:hAnsi="Times New Roman"/>
+          <w:b w:val="false"/>
+          <w:bCs w:val="false"/>
+          <w:color w:val="000000"/>
+          <w:sz w:val="24"/>
+          <w:szCs w:val="24"/>
+          <w:u w:val="none"/>
+          <w:lang w:val="en-US"/>
+        </w:rPr>
+        <w:t>toolsGroup-&gt;addAction(ui-&gt;rectangle);</w:t>
+      </w:r>
+    </w:p>
+    <w:p>
+      <w:pPr>
+        <w:pStyle w:val="Normal"/>
+        <w:bidi w:val="0"/>
+        <w:spacing w:lineRule="exact" w:line="259" w:before="0" w:after="160"/>
+        <w:ind w:hanging="0" w:left="0" w:right="0"/>
+        <w:jc w:val="left"/>
+        <w:rPr>
+          <w:color w:val="000000"/>
+        </w:rPr>
+      </w:pPr>
+      <w:r>
+        <w:rPr>
+          <w:rFonts w:ascii="Times New Roman" w:hAnsi="Times New Roman"/>
+          <w:b w:val="false"/>
+          <w:bCs w:val="false"/>
+          <w:color w:val="000000"/>
+          <w:sz w:val="24"/>
+          <w:szCs w:val="24"/>
+          <w:u w:val="none"/>
+          <w:lang w:val="en-US"/>
+        </w:rPr>
+        <w:t xml:space="preserve">    </w:t>
+      </w:r>
+      <w:r>
+        <w:rPr>
+          <w:rFonts w:ascii="Times New Roman" w:hAnsi="Times New Roman"/>
+          <w:b w:val="false"/>
+          <w:bCs w:val="false"/>
+          <w:color w:val="000000"/>
+          <w:sz w:val="24"/>
+          <w:szCs w:val="24"/>
+          <w:u w:val="none"/>
+          <w:lang w:val="en-US"/>
+        </w:rPr>
+        <w:t>ui-&gt;line-&gt;setChecked(true);</w:t>
+      </w:r>
+    </w:p>
+    <w:p>
+      <w:pPr>
+        <w:pStyle w:val="Normal"/>
+        <w:bidi w:val="0"/>
+        <w:spacing w:lineRule="exact" w:line="259" w:before="0" w:after="160"/>
+        <w:ind w:hanging="0" w:left="0" w:right="0"/>
+        <w:jc w:val="left"/>
+        <w:rPr>
+          <w:color w:val="000000"/>
+        </w:rPr>
+      </w:pPr>
+      <w:r>
+        <w:rPr>
+          <w:rFonts w:ascii="Times New Roman" w:hAnsi="Times New Roman"/>
+          <w:b w:val="false"/>
+          <w:bCs w:val="false"/>
+          <w:color w:val="000000"/>
+          <w:sz w:val="24"/>
+          <w:szCs w:val="24"/>
+          <w:u w:val="none"/>
+          <w:lang w:val="en-US"/>
+        </w:rPr>
+        <w:t>}</w:t>
+      </w:r>
+    </w:p>
+    <w:p>
+      <w:pPr>
+        <w:pStyle w:val="Normal"/>
+        <w:bidi w:val="0"/>
+        <w:spacing w:lineRule="exact" w:line="259" w:before="0" w:after="160"/>
+        <w:ind w:hanging="0" w:left="0" w:right="0"/>
+        <w:jc w:val="left"/>
+        <w:rPr>
+          <w:color w:val="000000"/>
+        </w:rPr>
+      </w:pPr>
+      <w:r>
+        <w:rPr>
+          <w:color w:val="000000"/>
+        </w:rPr>
+      </w:r>
+    </w:p>
+    <w:p>
+      <w:pPr>
+        <w:pStyle w:val="Normal"/>
+        <w:bidi w:val="0"/>
+        <w:spacing w:lineRule="exact" w:line="259" w:before="0" w:after="160"/>
+        <w:ind w:hanging="0" w:left="0" w:right="0"/>
+        <w:jc w:val="left"/>
+        <w:rPr>
+          <w:color w:val="000000"/>
+        </w:rPr>
+      </w:pPr>
+      <w:r>
+        <w:rPr>
+          <w:rFonts w:ascii="Times New Roman" w:hAnsi="Times New Roman"/>
+          <w:b w:val="false"/>
+          <w:bCs w:val="false"/>
+          <w:color w:val="000000"/>
+          <w:sz w:val="24"/>
+          <w:szCs w:val="24"/>
+          <w:u w:val="none"/>
+          <w:lang w:val="en-US"/>
+        </w:rPr>
+        <w:t>MainWindow::~MainWindow()</w:t>
+      </w:r>
+    </w:p>
+    <w:p>
+      <w:pPr>
+        <w:pStyle w:val="Normal"/>
+        <w:bidi w:val="0"/>
+        <w:spacing w:lineRule="exact" w:line="259" w:before="0" w:after="160"/>
+        <w:ind w:hanging="0" w:left="0" w:right="0"/>
+        <w:jc w:val="left"/>
+        <w:rPr>
+          <w:color w:val="000000"/>
+        </w:rPr>
+      </w:pPr>
+      <w:r>
+        <w:rPr>
+          <w:rFonts w:ascii="Times New Roman" w:hAnsi="Times New Roman"/>
+          <w:b w:val="false"/>
+          <w:bCs w:val="false"/>
+          <w:color w:val="000000"/>
+          <w:sz w:val="24"/>
+          <w:szCs w:val="24"/>
+          <w:u w:val="none"/>
+          <w:lang w:val="en-US"/>
+        </w:rPr>
         <w:t>{</w:t>
       </w:r>
     </w:p>
@@ -1574,7 +2554,7 @@
           <w:u w:val="none"/>
           <w:lang w:val="en-US"/>
         </w:rPr>
-        <w:t>ui-&gt;setupUi(this);</w:t>
+        <w:t>delete manager;</w:t>
       </w:r>
     </w:p>
     <w:p>
@@ -1612,7 +2592,7 @@
           <w:u w:val="none"/>
           <w:lang w:val="en-US"/>
         </w:rPr>
-        <w:t>manager = new ShapeObjectsEditor();</w:t>
+        <w:t>delete ui;</w:t>
       </w:r>
     </w:p>
     <w:p>
@@ -1637,8 +2617,37 @@
           <w:u w:val="none"/>
           <w:lang w:val="en-US"/>
         </w:rPr>
-        <w:t xml:space="preserve">    </w:t>
-      </w:r>
+        <w:t>}</w:t>
+      </w:r>
+    </w:p>
+    <w:p>
+      <w:pPr>
+        <w:pStyle w:val="Normal"/>
+        <w:bidi w:val="0"/>
+        <w:spacing w:lineRule="exact" w:line="259" w:before="0" w:after="160"/>
+        <w:ind w:hanging="0" w:left="0" w:right="0"/>
+        <w:jc w:val="left"/>
+        <w:rPr>
+          <w:color w:val="000000"/>
+        </w:rPr>
+      </w:pPr>
+      <w:r>
+        <w:rPr>
+          <w:color w:val="000000"/>
+        </w:rPr>
+      </w:r>
+    </w:p>
+    <w:p>
+      <w:pPr>
+        <w:pStyle w:val="Normal"/>
+        <w:bidi w:val="0"/>
+        <w:spacing w:lineRule="exact" w:line="259" w:before="0" w:after="160"/>
+        <w:ind w:hanging="0" w:left="0" w:right="0"/>
+        <w:jc w:val="left"/>
+        <w:rPr>
+          <w:color w:val="000000"/>
+        </w:rPr>
+      </w:pPr>
       <w:r>
         <w:rPr>
           <w:rFonts w:ascii="Times New Roman" w:hAnsi="Times New Roman"/>
@@ -1650,6 +2659,69 @@
           <w:u w:val="none"/>
           <w:lang w:val="en-US"/>
         </w:rPr>
+        <w:t>void MainWindow::on_line_triggered()</w:t>
+      </w:r>
+    </w:p>
+    <w:p>
+      <w:pPr>
+        <w:pStyle w:val="Normal"/>
+        <w:bidi w:val="0"/>
+        <w:spacing w:lineRule="exact" w:line="259" w:before="0" w:after="160"/>
+        <w:ind w:hanging="0" w:left="0" w:right="0"/>
+        <w:jc w:val="left"/>
+        <w:rPr>
+          <w:color w:val="000000"/>
+        </w:rPr>
+      </w:pPr>
+      <w:r>
+        <w:rPr>
+          <w:rFonts w:ascii="Times New Roman" w:hAnsi="Times New Roman"/>
+          <w:b w:val="false"/>
+          <w:bCs w:val="false"/>
+          <w:color w:val="000000"/>
+          <w:sz w:val="24"/>
+          <w:szCs w:val="24"/>
+          <w:u w:val="none"/>
+          <w:lang w:val="en-US"/>
+        </w:rPr>
+        <w:t>{</w:t>
+      </w:r>
+    </w:p>
+    <w:p>
+      <w:pPr>
+        <w:pStyle w:val="Normal"/>
+        <w:bidi w:val="0"/>
+        <w:spacing w:lineRule="exact" w:line="259" w:before="0" w:after="160"/>
+        <w:ind w:hanging="0" w:left="0" w:right="0"/>
+        <w:jc w:val="left"/>
+        <w:rPr>
+          <w:color w:val="000000"/>
+        </w:rPr>
+      </w:pPr>
+      <w:r>
+        <w:rPr>
+          <w:rFonts w:ascii="Times New Roman" w:hAnsi="Times New Roman"/>
+          <w:b w:val="false"/>
+          <w:bCs w:val="false"/>
+          <w:color w:val="000000"/>
+          <w:sz w:val="24"/>
+          <w:szCs w:val="24"/>
+          <w:u w:val="none"/>
+          <w:lang w:val="en-US"/>
+        </w:rPr>
+        <w:t xml:space="preserve">    </w:t>
+      </w:r>
+      <w:r>
+        <w:rPr>
+          <w:rFonts w:ascii="Times New Roman" w:hAnsi="Times New Roman"/>
+          <w:b w:val="false"/>
+          <w:bCs w:val="false"/>
+          <w:color w:val="000000"/>
+          <w:sz w:val="24"/>
+          <w:szCs w:val="24"/>
+          <w:u w:val="none"/>
+          <w:lang w:val="en-US"/>
+        </w:rPr>
         <w:t>manager-&gt;StartLineEditor();</w:t>
       </w:r>
     </w:p>
@@ -1713,6 +2785,7 @@
           <w:u w:val="none"/>
           <w:lang w:val="en-US"/>
         </w:rPr>
+        <w:t>}</w:t>
       </w:r>
     </w:p>
     <w:p>
@@ -1728,6 +2801,23 @@
       </w:pPr>
       <w:r>
         <w:rPr>
+          <w:color w:val="000000"/>
+        </w:rPr>
+      </w:r>
+    </w:p>
+    <w:p>
+      <w:pPr>
+        <w:pStyle w:val="Normal"/>
+        <w:bidi w:val="0"/>
+        <w:spacing w:lineRule="exact" w:line="259" w:before="0" w:after="160"/>
+        <w:ind w:hanging="0" w:left="0" w:right="0"/>
+        <w:jc w:val="left"/>
+        <w:rPr>
+          <w:color w:val="000000"/>
+        </w:rPr>
+      </w:pPr>
+      <w:r>
+        <w:rPr>
           <w:rFonts w:ascii="Times New Roman" w:hAnsi="Times New Roman"/>
           <w:b w:val="false"/>
           <w:bCs w:val="false"/>
@@ -1737,8 +2827,20 @@
           <w:u w:val="none"/>
           <w:lang w:val="en-US"/>
         </w:rPr>
-        <w:t xml:space="preserve">    </w:t>
-      </w:r>
+        <w:t>void MainWindow::on_rectangle_triggered()</w:t>
+      </w:r>
+    </w:p>
+    <w:p>
+      <w:pPr>
+        <w:pStyle w:val="Normal"/>
+        <w:bidi w:val="0"/>
+        <w:spacing w:lineRule="exact" w:line="259" w:before="0" w:after="160"/>
+        <w:ind w:hanging="0" w:left="0" w:right="0"/>
+        <w:jc w:val="left"/>
+        <w:rPr>
+          <w:color w:val="000000"/>
+        </w:rPr>
+      </w:pPr>
       <w:r>
         <w:rPr>
           <w:rFonts w:ascii="Times New Roman" w:hAnsi="Times New Roman"/>
@@ -1750,7 +2852,7 @@
           <w:u w:val="none"/>
           <w:lang w:val="en-US"/>
         </w:rPr>
-        <w:t>MainWidget* widget = new MainWidget(manager, this);</w:t>
+        <w:t>{</w:t>
       </w:r>
     </w:p>
     <w:p>
@@ -1788,7 +2890,7 @@
           <w:u w:val="none"/>
           <w:lang w:val="en-US"/>
         </w:rPr>
-        <w:t>widget-&gt;setMouseTracking(true);</w:t>
+        <w:t>manager-&gt;StartRectEditor();</w:t>
       </w:r>
     </w:p>
     <w:p>
@@ -1826,7 +2928,7 @@
           <w:u w:val="none"/>
           <w:lang w:val="en-US"/>
         </w:rPr>
-        <w:t>this-&gt;setCentralWidget(widget);</w:t>
+        <w:t>this-&gt;setWindowTitle("Поточний об'єкт: Прямокутник");</w:t>
       </w:r>
     </w:p>
     <w:p>
@@ -1851,6 +2953,7 @@
           <w:u w:val="none"/>
           <w:lang w:val="en-US"/>
         </w:rPr>
+        <w:t>}</w:t>
       </w:r>
     </w:p>
     <w:p>
@@ -1866,6 +2969,40 @@
       </w:pPr>
       <w:r>
         <w:rPr>
+          <w:color w:val="000000"/>
+        </w:rPr>
+      </w:r>
+    </w:p>
+    <w:p>
+      <w:pPr>
+        <w:pStyle w:val="Normal"/>
+        <w:bidi w:val="0"/>
+        <w:spacing w:lineRule="exact" w:line="259" w:before="0" w:after="160"/>
+        <w:ind w:hanging="0" w:left="0" w:right="0"/>
+        <w:jc w:val="left"/>
+        <w:rPr>
+          <w:color w:val="000000"/>
+        </w:rPr>
+      </w:pPr>
+      <w:r>
+        <w:rPr>
+          <w:color w:val="000000"/>
+        </w:rPr>
+      </w:r>
+    </w:p>
+    <w:p>
+      <w:pPr>
+        <w:pStyle w:val="Normal"/>
+        <w:bidi w:val="0"/>
+        <w:spacing w:lineRule="exact" w:line="259" w:before="0" w:after="160"/>
+        <w:ind w:hanging="0" w:left="0" w:right="0"/>
+        <w:jc w:val="left"/>
+        <w:rPr>
+          <w:color w:val="000000"/>
+        </w:rPr>
+      </w:pPr>
+      <w:r>
+        <w:rPr>
           <w:rFonts w:ascii="Times New Roman" w:hAnsi="Times New Roman"/>
           <w:b w:val="false"/>
           <w:bCs w:val="false"/>
@@ -1875,8 +3012,20 @@
           <w:u w:val="none"/>
           <w:lang w:val="en-US"/>
         </w:rPr>
-        <w:t xml:space="preserve">    </w:t>
-      </w:r>
+        <w:t>void MainWindow::on_ellipse_triggered()</w:t>
+      </w:r>
+    </w:p>
+    <w:p>
+      <w:pPr>
+        <w:pStyle w:val="Normal"/>
+        <w:bidi w:val="0"/>
+        <w:spacing w:lineRule="exact" w:line="259" w:before="0" w:after="160"/>
+        <w:ind w:hanging="0" w:left="0" w:right="0"/>
+        <w:jc w:val="left"/>
+        <w:rPr>
+          <w:color w:val="000000"/>
+        </w:rPr>
+      </w:pPr>
       <w:r>
         <w:rPr>
           <w:rFonts w:ascii="Times New Roman" w:hAnsi="Times New Roman"/>
@@ -1888,7 +3037,7 @@
           <w:u w:val="none"/>
           <w:lang w:val="en-US"/>
         </w:rPr>
-        <w:t>QActionGroup* toolsGroup = new QActionGroup(this);</w:t>
+        <w:t>{</w:t>
       </w:r>
     </w:p>
     <w:p>
@@ -1926,7 +3075,7 @@
           <w:u w:val="none"/>
           <w:lang w:val="en-US"/>
         </w:rPr>
-        <w:t>toolsGroup-&gt;setExclusive(true);</w:t>
+        <w:t>manager-&gt;StartEllipseEditor();</w:t>
       </w:r>
     </w:p>
     <w:p>
@@ -1964,7 +3113,7 @@
           <w:u w:val="none"/>
           <w:lang w:val="en-US"/>
         </w:rPr>
-        <w:t>toolsGroup-&gt;addAction(ui-&gt;ellipse);</w:t>
+        <w:t>this-&gt;setWindowTitle("Поточний об'єкт: Еліпс");</w:t>
       </w:r>
     </w:p>
     <w:p>
@@ -1989,8 +3138,37 @@
           <w:u w:val="none"/>
           <w:lang w:val="en-US"/>
         </w:rPr>
-        <w:t xml:space="preserve">    </w:t>
-      </w:r>
+        <w:t>}</w:t>
+      </w:r>
+    </w:p>
+    <w:p>
+      <w:pPr>
+        <w:pStyle w:val="Normal"/>
+        <w:bidi w:val="0"/>
+        <w:spacing w:lineRule="exact" w:line="259" w:before="0" w:after="160"/>
+        <w:ind w:hanging="0" w:left="0" w:right="0"/>
+        <w:jc w:val="left"/>
+        <w:rPr>
+          <w:color w:val="000000"/>
+        </w:rPr>
+      </w:pPr>
+      <w:r>
+        <w:rPr>
+          <w:color w:val="000000"/>
+        </w:rPr>
+      </w:r>
+    </w:p>
+    <w:p>
+      <w:pPr>
+        <w:pStyle w:val="Normal"/>
+        <w:bidi w:val="0"/>
+        <w:spacing w:lineRule="exact" w:line="259" w:before="0" w:after="160"/>
+        <w:ind w:hanging="0" w:left="0" w:right="0"/>
+        <w:jc w:val="left"/>
+        <w:rPr>
+          <w:color w:val="000000"/>
+        </w:rPr>
+      </w:pPr>
       <w:r>
         <w:rPr>
           <w:rFonts w:ascii="Times New Roman" w:hAnsi="Times New Roman"/>
@@ -2002,7 +3180,7 @@
           <w:u w:val="none"/>
           <w:lang w:val="en-US"/>
         </w:rPr>
-        <w:t>toolsGroup-&gt;addAction(ui-&gt;line);</w:t>
+        <w:t>void MainWindow::on_point_triggered()</w:t>
       </w:r>
     </w:p>
     <w:p>
@@ -2027,8 +3205,20 @@
           <w:u w:val="none"/>
           <w:lang w:val="en-US"/>
         </w:rPr>
-        <w:t xml:space="preserve">    </w:t>
-      </w:r>
+        <w:t>{</w:t>
+      </w:r>
+    </w:p>
+    <w:p>
+      <w:pPr>
+        <w:pStyle w:val="Normal"/>
+        <w:bidi w:val="0"/>
+        <w:spacing w:lineRule="exact" w:line="259" w:before="0" w:after="160"/>
+        <w:ind w:hanging="0" w:left="0" w:right="0"/>
+        <w:jc w:val="left"/>
+        <w:rPr>
+          <w:color w:val="000000"/>
+        </w:rPr>
+      </w:pPr>
       <w:r>
         <w:rPr>
           <w:rFonts w:ascii="Times New Roman" w:hAnsi="Times New Roman"/>
@@ -2040,7 +3230,20 @@
           <w:u w:val="none"/>
           <w:lang w:val="en-US"/>
         </w:rPr>
-        <w:t>toolsGroup-&gt;addAction(ui-&gt;point);</w:t>
+        <w:t xml:space="preserve">    </w:t>
+      </w:r>
+      <w:r>
+        <w:rPr>
+          <w:rFonts w:ascii="Times New Roman" w:hAnsi="Times New Roman"/>
+          <w:b w:val="false"/>
+          <w:bCs w:val="false"/>
+          <w:color w:val="000000"/>
+          <w:sz w:val="24"/>
+          <w:szCs w:val="24"/>
+          <w:u w:val="none"/>
+          <w:lang w:val="en-US"/>
+        </w:rPr>
+        <w:t>manager-&gt;StartPointEditor();</w:t>
       </w:r>
     </w:p>
     <w:p>
@@ -2078,7 +3281,7 @@
           <w:u w:val="none"/>
           <w:lang w:val="en-US"/>
         </w:rPr>
-        <w:t>toolsGroup-&gt;addAction(ui-&gt;rectangle);</w:t>
+        <w:t>this-&gt;setWindowTitle("Поточний об'єкт: Крапка");</w:t>
       </w:r>
     </w:p>
     <w:p>
@@ -2103,8 +3306,37 @@
           <w:u w:val="none"/>
           <w:lang w:val="en-US"/>
         </w:rPr>
-        <w:t xml:space="preserve">    </w:t>
-      </w:r>
+        <w:t>}</w:t>
+      </w:r>
+    </w:p>
+    <w:p>
+      <w:pPr>
+        <w:pStyle w:val="Normal"/>
+        <w:bidi w:val="0"/>
+        <w:spacing w:lineRule="exact" w:line="259" w:before="0" w:after="160"/>
+        <w:ind w:hanging="0" w:left="0" w:right="0"/>
+        <w:jc w:val="left"/>
+        <w:rPr>
+          <w:color w:val="000000"/>
+        </w:rPr>
+      </w:pPr>
+      <w:r>
+        <w:rPr>
+          <w:color w:val="000000"/>
+        </w:rPr>
+      </w:r>
+    </w:p>
+    <w:p>
+      <w:pPr>
+        <w:pStyle w:val="Normal"/>
+        <w:bidi w:val="0"/>
+        <w:spacing w:lineRule="exact" w:line="259" w:before="0" w:after="160"/>
+        <w:ind w:hanging="0" w:left="0" w:right="0"/>
+        <w:jc w:val="left"/>
+        <w:rPr>
+          <w:color w:val="000000"/>
+        </w:rPr>
+      </w:pPr>
       <w:r>
         <w:rPr>
           <w:rFonts w:ascii="Times New Roman" w:hAnsi="Times New Roman"/>
@@ -2116,7 +3348,7 @@
           <w:u w:val="none"/>
           <w:lang w:val="en-US"/>
         </w:rPr>
-        <w:t>ui-&gt;line-&gt;setChecked(true);</w:t>
+        <w:t>void MainWindow::on_back_triggered()</w:t>
       </w:r>
     </w:p>
     <w:p>
@@ -2141,6 +3373,107 @@
           <w:u w:val="none"/>
           <w:lang w:val="en-US"/>
         </w:rPr>
+        <w:t>{</w:t>
+      </w:r>
+    </w:p>
+    <w:p>
+      <w:pPr>
+        <w:pStyle w:val="Normal"/>
+        <w:bidi w:val="0"/>
+        <w:spacing w:lineRule="exact" w:line="259" w:before="0" w:after="160"/>
+        <w:ind w:hanging="0" w:left="0" w:right="0"/>
+        <w:jc w:val="left"/>
+        <w:rPr>
+          <w:color w:val="000000"/>
+        </w:rPr>
+      </w:pPr>
+      <w:r>
+        <w:rPr>
+          <w:rFonts w:ascii="Times New Roman" w:hAnsi="Times New Roman"/>
+          <w:b w:val="false"/>
+          <w:bCs w:val="false"/>
+          <w:color w:val="000000"/>
+          <w:sz w:val="24"/>
+          <w:szCs w:val="24"/>
+          <w:u w:val="none"/>
+          <w:lang w:val="en-US"/>
+        </w:rPr>
+        <w:t xml:space="preserve">    </w:t>
+      </w:r>
+      <w:r>
+        <w:rPr>
+          <w:rFonts w:ascii="Times New Roman" w:hAnsi="Times New Roman"/>
+          <w:b w:val="false"/>
+          <w:bCs w:val="false"/>
+          <w:color w:val="000000"/>
+          <w:sz w:val="24"/>
+          <w:szCs w:val="24"/>
+          <w:u w:val="none"/>
+          <w:lang w:val="en-US"/>
+        </w:rPr>
+        <w:t>manager-&gt;RemoveLastShape();</w:t>
+      </w:r>
+    </w:p>
+    <w:p>
+      <w:pPr>
+        <w:pStyle w:val="Normal"/>
+        <w:bidi w:val="0"/>
+        <w:spacing w:lineRule="exact" w:line="259" w:before="0" w:after="160"/>
+        <w:ind w:hanging="0" w:left="0" w:right="0"/>
+        <w:jc w:val="left"/>
+        <w:rPr>
+          <w:color w:val="000000"/>
+        </w:rPr>
+      </w:pPr>
+      <w:r>
+        <w:rPr>
+          <w:rFonts w:ascii="Times New Roman" w:hAnsi="Times New Roman"/>
+          <w:b w:val="false"/>
+          <w:bCs w:val="false"/>
+          <w:color w:val="000000"/>
+          <w:sz w:val="24"/>
+          <w:szCs w:val="24"/>
+          <w:u w:val="none"/>
+          <w:lang w:val="en-US"/>
+        </w:rPr>
+        <w:t xml:space="preserve">    </w:t>
+      </w:r>
+      <w:r>
+        <w:rPr>
+          <w:rFonts w:ascii="Times New Roman" w:hAnsi="Times New Roman"/>
+          <w:b w:val="false"/>
+          <w:bCs w:val="false"/>
+          <w:color w:val="000000"/>
+          <w:sz w:val="24"/>
+          <w:szCs w:val="24"/>
+          <w:u w:val="none"/>
+          <w:lang w:val="en-US"/>
+        </w:rPr>
+        <w:t>update();</w:t>
+      </w:r>
+    </w:p>
+    <w:p>
+      <w:pPr>
+        <w:pStyle w:val="Normal"/>
+        <w:bidi w:val="0"/>
+        <w:spacing w:lineRule="exact" w:line="259" w:before="0" w:after="160"/>
+        <w:ind w:hanging="0" w:left="0" w:right="0"/>
+        <w:jc w:val="left"/>
+        <w:rPr>
+          <w:color w:val="000000"/>
+        </w:rPr>
+      </w:pPr>
+      <w:r>
+        <w:rPr>
+          <w:rFonts w:ascii="Times New Roman" w:hAnsi="Times New Roman"/>
+          <w:b w:val="false"/>
+          <w:bCs w:val="false"/>
+          <w:color w:val="000000"/>
+          <w:sz w:val="24"/>
+          <w:szCs w:val="24"/>
+          <w:u w:val="none"/>
+          <w:lang w:val="en-US"/>
+        </w:rPr>
         <w:t>}</w:t>
       </w:r>
     </w:p>
@@ -2157,6 +3490,57 @@
       </w:pPr>
       <w:r>
         <w:rPr>
+          <w:color w:val="000000"/>
+        </w:rPr>
+      </w:r>
+    </w:p>
+    <w:p>
+      <w:pPr>
+        <w:pStyle w:val="Normal"/>
+        <w:bidi w:val="0"/>
+        <w:spacing w:lineRule="exact" w:line="259" w:before="0" w:after="160"/>
+        <w:ind w:hanging="0" w:left="0" w:right="0"/>
+        <w:jc w:val="left"/>
+        <w:rPr>
+          <w:color w:val="000000"/>
+        </w:rPr>
+      </w:pPr>
+      <w:r>
+        <w:rPr>
+          <w:color w:val="000000"/>
+        </w:rPr>
+      </w:r>
+    </w:p>
+    <w:p>
+      <w:pPr>
+        <w:pStyle w:val="Normal"/>
+        <w:bidi w:val="0"/>
+        <w:spacing w:lineRule="exact" w:line="259" w:before="0" w:after="160"/>
+        <w:ind w:hanging="0" w:left="0" w:right="0"/>
+        <w:jc w:val="left"/>
+        <w:rPr>
+          <w:color w:val="000000"/>
+        </w:rPr>
+      </w:pPr>
+      <w:r>
+        <w:rPr>
+          <w:color w:val="000000"/>
+        </w:rPr>
+      </w:r>
+    </w:p>
+    <w:p>
+      <w:pPr>
+        <w:pStyle w:val="Normal"/>
+        <w:bidi w:val="0"/>
+        <w:spacing w:lineRule="exact" w:line="259" w:before="0" w:after="160"/>
+        <w:ind w:hanging="0" w:left="0" w:right="0"/>
+        <w:jc w:val="left"/>
+        <w:rPr>
+          <w:color w:val="000000"/>
+        </w:rPr>
+      </w:pPr>
+      <w:r>
+        <w:rPr>
           <w:rFonts w:ascii="Times New Roman" w:hAnsi="Times New Roman"/>
           <w:b w:val="false"/>
           <w:bCs w:val="false"/>
@@ -2166,6 +3550,7 @@
           <w:u w:val="none"/>
           <w:lang w:val="en-US"/>
         </w:rPr>
+        <w:t>void MainWindow::on_color_triggered()</w:t>
       </w:r>
     </w:p>
     <w:p>
@@ -2190,7 +3575,7 @@
           <w:u w:val="none"/>
           <w:lang w:val="en-US"/>
         </w:rPr>
-        <w:t>MainWindow::~MainWindow()</w:t>
+        <w:t>{</w:t>
       </w:r>
     </w:p>
     <w:p>
@@ -2215,7 +3600,20 @@
           <w:u w:val="none"/>
           <w:lang w:val="en-US"/>
         </w:rPr>
-        <w:t>{</w:t>
+        <w:t xml:space="preserve">    </w:t>
+      </w:r>
+      <w:r>
+        <w:rPr>
+          <w:rFonts w:ascii="Times New Roman" w:hAnsi="Times New Roman"/>
+          <w:b w:val="false"/>
+          <w:bCs w:val="false"/>
+          <w:color w:val="000000"/>
+          <w:sz w:val="24"/>
+          <w:szCs w:val="24"/>
+          <w:u w:val="none"/>
+          <w:lang w:val="en-US"/>
+        </w:rPr>
+        <w:t>QColor chosenColor = QColorDialog::getColor(Qt::black, nullptr,"Виберіть колір");</w:t>
       </w:r>
     </w:p>
     <w:p>
@@ -2253,7 +3651,7 @@
           <w:u w:val="none"/>
           <w:lang w:val="en-US"/>
         </w:rPr>
-        <w:t>delete manager;</w:t>
+        <w:t>if(chosenColor.isValid()) {</w:t>
       </w:r>
     </w:p>
     <w:p>
@@ -2278,7 +3676,7 @@
           <w:u w:val="none"/>
           <w:lang w:val="en-US"/>
         </w:rPr>
-        <w:t xml:space="preserve">    </w:t>
+        <w:t xml:space="preserve">        </w:t>
       </w:r>
       <w:r>
         <w:rPr>
@@ -2291,7 +3689,7 @@
           <w:u w:val="none"/>
           <w:lang w:val="en-US"/>
         </w:rPr>
-        <w:t>delete ui;</w:t>
+        <w:t>manager-&gt;setCurrentColor(chosenColor);</w:t>
       </w:r>
     </w:p>
     <w:p>
@@ -2316,6 +3714,19 @@
           <w:u w:val="none"/>
           <w:lang w:val="en-US"/>
         </w:rPr>
+        <w:t xml:space="preserve">    </w:t>
+      </w:r>
+      <w:r>
+        <w:rPr>
+          <w:rFonts w:ascii="Times New Roman" w:hAnsi="Times New Roman"/>
+          <w:b w:val="false"/>
+          <w:bCs w:val="false"/>
+          <w:color w:val="000000"/>
+          <w:sz w:val="24"/>
+          <w:szCs w:val="24"/>
+          <w:u w:val="none"/>
+          <w:lang w:val="en-US"/>
+        </w:rPr>
         <w:t>}</w:t>
       </w:r>
     </w:p>
@@ -2332,6 +3743,23 @@
       </w:pPr>
       <w:r>
         <w:rPr>
+          <w:color w:val="000000"/>
+        </w:rPr>
+      </w:r>
+    </w:p>
+    <w:p>
+      <w:pPr>
+        <w:pStyle w:val="Normal"/>
+        <w:bidi w:val="0"/>
+        <w:spacing w:lineRule="exact" w:line="259" w:before="0" w:after="160"/>
+        <w:ind w:hanging="0" w:left="0" w:right="0"/>
+        <w:jc w:val="left"/>
+        <w:rPr>
+          <w:color w:val="000000"/>
+        </w:rPr>
+      </w:pPr>
+      <w:r>
+        <w:rPr>
           <w:rFonts w:ascii="Times New Roman" w:hAnsi="Times New Roman"/>
           <w:b w:val="false"/>
           <w:bCs w:val="false"/>
@@ -2341,6 +3769,7 @@
           <w:u w:val="none"/>
           <w:lang w:val="en-US"/>
         </w:rPr>
+        <w:t>}</w:t>
       </w:r>
     </w:p>
     <w:p>
@@ -2351,11 +3780,6 @@
         <w:ind w:hanging="0" w:left="0" w:right="0"/>
         <w:jc w:val="left"/>
         <w:rPr>
-          <w:color w:val="000000"/>
-        </w:rPr>
-      </w:pPr>
-      <w:r>
-        <w:rPr>
           <w:rFonts w:ascii="Times New Roman" w:hAnsi="Times New Roman"/>
           <w:b w:val="false"/>
           <w:bCs w:val="false"/>
@@ -2365,7 +3789,18 @@
           <w:u w:val="none"/>
           <w:lang w:val="en-US"/>
         </w:rPr>
-        <w:t>void MainWindow::on_line_triggered()</w:t>
+      </w:pPr>
+      <w:r>
+        <w:rPr>
+          <w:rFonts w:ascii="Times New Roman" w:hAnsi="Times New Roman"/>
+          <w:b w:val="false"/>
+          <w:bCs w:val="false"/>
+          <w:color w:val="000000"/>
+          <w:sz w:val="24"/>
+          <w:szCs w:val="24"/>
+          <w:u w:val="none"/>
+          <w:lang w:val="en-US"/>
+        </w:rPr>
       </w:r>
     </w:p>
     <w:p>
@@ -2381,1210 +3816,8 @@
       </w:pPr>
       <w:r>
         <w:rPr>
-          <w:rFonts w:ascii="Times New Roman" w:hAnsi="Times New Roman"/>
-          <w:b w:val="false"/>
-          <w:bCs w:val="false"/>
-          <w:color w:val="000000"/>
-          <w:sz w:val="24"/>
-          <w:szCs w:val="24"/>
-          <w:u w:val="none"/>
-          <w:lang w:val="en-US"/>
-        </w:rPr>
-        <w:t>{</w:t>
-      </w:r>
-    </w:p>
-    <w:p>
-      <w:pPr>
-        <w:pStyle w:val="Normal"/>
-        <w:bidi w:val="0"/>
-        <w:spacing w:lineRule="exact" w:line="259" w:before="0" w:after="160"/>
-        <w:ind w:hanging="0" w:left="0" w:right="0"/>
-        <w:jc w:val="left"/>
-        <w:rPr>
-          <w:color w:val="000000"/>
-        </w:rPr>
-      </w:pPr>
-      <w:r>
-        <w:rPr>
-          <w:rFonts w:ascii="Times New Roman" w:hAnsi="Times New Roman"/>
-          <w:b w:val="false"/>
-          <w:bCs w:val="false"/>
-          <w:color w:val="000000"/>
-          <w:sz w:val="24"/>
-          <w:szCs w:val="24"/>
-          <w:u w:val="none"/>
-          <w:lang w:val="en-US"/>
-        </w:rPr>
-        <w:t xml:space="preserve">    </w:t>
-      </w:r>
-      <w:r>
-        <w:rPr>
-          <w:rFonts w:ascii="Times New Roman" w:hAnsi="Times New Roman"/>
-          <w:b w:val="false"/>
-          <w:bCs w:val="false"/>
-          <w:color w:val="000000"/>
-          <w:sz w:val="24"/>
-          <w:szCs w:val="24"/>
-          <w:u w:val="none"/>
-          <w:lang w:val="en-US"/>
-        </w:rPr>
-        <w:t>manager-&gt;StartLineEditor();</w:t>
-      </w:r>
-    </w:p>
-    <w:p>
-      <w:pPr>
-        <w:pStyle w:val="Normal"/>
-        <w:bidi w:val="0"/>
-        <w:spacing w:lineRule="exact" w:line="259" w:before="0" w:after="160"/>
-        <w:ind w:hanging="0" w:left="0" w:right="0"/>
-        <w:jc w:val="left"/>
-        <w:rPr>
-          <w:color w:val="000000"/>
-        </w:rPr>
-      </w:pPr>
-      <w:r>
-        <w:rPr>
-          <w:rFonts w:ascii="Times New Roman" w:hAnsi="Times New Roman"/>
-          <w:b w:val="false"/>
-          <w:bCs w:val="false"/>
-          <w:color w:val="000000"/>
-          <w:sz w:val="24"/>
-          <w:szCs w:val="24"/>
-          <w:u w:val="none"/>
-          <w:lang w:val="en-US"/>
-        </w:rPr>
-        <w:t xml:space="preserve">    </w:t>
-      </w:r>
-      <w:r>
-        <w:rPr>
-          <w:rFonts w:ascii="Times New Roman" w:hAnsi="Times New Roman"/>
-          <w:b w:val="false"/>
-          <w:bCs w:val="false"/>
-          <w:color w:val="000000"/>
-          <w:sz w:val="24"/>
-          <w:szCs w:val="24"/>
-          <w:u w:val="none"/>
-          <w:lang w:val="en-US"/>
-        </w:rPr>
-        <w:t>this-&gt;setWindowTitle("Поточний об'єкт: Лінія");</w:t>
-      </w:r>
-    </w:p>
-    <w:p>
-      <w:pPr>
-        <w:pStyle w:val="Normal"/>
-        <w:bidi w:val="0"/>
-        <w:spacing w:lineRule="exact" w:line="259" w:before="0" w:after="160"/>
-        <w:ind w:hanging="0" w:left="0" w:right="0"/>
-        <w:jc w:val="left"/>
-        <w:rPr>
-          <w:color w:val="000000"/>
-        </w:rPr>
-      </w:pPr>
-      <w:r>
-        <w:rPr>
-          <w:rFonts w:ascii="Times New Roman" w:hAnsi="Times New Roman"/>
-          <w:b w:val="false"/>
-          <w:bCs w:val="false"/>
-          <w:color w:val="000000"/>
-          <w:sz w:val="24"/>
-          <w:szCs w:val="24"/>
-          <w:u w:val="none"/>
-          <w:lang w:val="en-US"/>
-        </w:rPr>
-        <w:t>}</w:t>
-      </w:r>
-    </w:p>
-    <w:p>
-      <w:pPr>
-        <w:pStyle w:val="Normal"/>
-        <w:bidi w:val="0"/>
-        <w:spacing w:lineRule="exact" w:line="259" w:before="0" w:after="160"/>
-        <w:ind w:hanging="0" w:left="0" w:right="0"/>
-        <w:jc w:val="left"/>
-        <w:rPr>
-          <w:color w:val="000000"/>
-        </w:rPr>
-      </w:pPr>
-      <w:r>
-        <w:rPr>
-          <w:rFonts w:ascii="Times New Roman" w:hAnsi="Times New Roman"/>
-          <w:b w:val="false"/>
-          <w:bCs w:val="false"/>
-          <w:color w:val="000000"/>
-          <w:sz w:val="24"/>
-          <w:szCs w:val="24"/>
-          <w:u w:val="none"/>
-          <w:lang w:val="en-US"/>
-        </w:rPr>
-      </w:r>
-    </w:p>
-    <w:p>
-      <w:pPr>
-        <w:pStyle w:val="Normal"/>
-        <w:bidi w:val="0"/>
-        <w:spacing w:lineRule="exact" w:line="259" w:before="0" w:after="160"/>
-        <w:ind w:hanging="0" w:left="0" w:right="0"/>
-        <w:jc w:val="left"/>
-        <w:rPr>
-          <w:color w:val="000000"/>
-        </w:rPr>
-      </w:pPr>
-      <w:r>
-        <w:rPr>
-          <w:rFonts w:ascii="Times New Roman" w:hAnsi="Times New Roman"/>
-          <w:b w:val="false"/>
-          <w:bCs w:val="false"/>
-          <w:color w:val="000000"/>
-          <w:sz w:val="24"/>
-          <w:szCs w:val="24"/>
-          <w:u w:val="none"/>
-          <w:lang w:val="en-US"/>
-        </w:rPr>
-        <w:t>void MainWindow::on_rectangle_triggered()</w:t>
-      </w:r>
-    </w:p>
-    <w:p>
-      <w:pPr>
-        <w:pStyle w:val="Normal"/>
-        <w:bidi w:val="0"/>
-        <w:spacing w:lineRule="exact" w:line="259" w:before="0" w:after="160"/>
-        <w:ind w:hanging="0" w:left="0" w:right="0"/>
-        <w:jc w:val="left"/>
-        <w:rPr>
-          <w:color w:val="000000"/>
-        </w:rPr>
-      </w:pPr>
-      <w:r>
-        <w:rPr>
-          <w:rFonts w:ascii="Times New Roman" w:hAnsi="Times New Roman"/>
-          <w:b w:val="false"/>
-          <w:bCs w:val="false"/>
-          <w:color w:val="000000"/>
-          <w:sz w:val="24"/>
-          <w:szCs w:val="24"/>
-          <w:u w:val="none"/>
-          <w:lang w:val="en-US"/>
-        </w:rPr>
-        <w:t>{</w:t>
-      </w:r>
-    </w:p>
-    <w:p>
-      <w:pPr>
-        <w:pStyle w:val="Normal"/>
-        <w:bidi w:val="0"/>
-        <w:spacing w:lineRule="exact" w:line="259" w:before="0" w:after="160"/>
-        <w:ind w:hanging="0" w:left="0" w:right="0"/>
-        <w:jc w:val="left"/>
-        <w:rPr>
-          <w:color w:val="000000"/>
-        </w:rPr>
-      </w:pPr>
-      <w:r>
-        <w:rPr>
-          <w:rFonts w:ascii="Times New Roman" w:hAnsi="Times New Roman"/>
-          <w:b w:val="false"/>
-          <w:bCs w:val="false"/>
-          <w:color w:val="000000"/>
-          <w:sz w:val="24"/>
-          <w:szCs w:val="24"/>
-          <w:u w:val="none"/>
-          <w:lang w:val="en-US"/>
-        </w:rPr>
-        <w:t xml:space="preserve">    </w:t>
-      </w:r>
-      <w:r>
-        <w:rPr>
-          <w:rFonts w:ascii="Times New Roman" w:hAnsi="Times New Roman"/>
-          <w:b w:val="false"/>
-          <w:bCs w:val="false"/>
-          <w:color w:val="000000"/>
-          <w:sz w:val="24"/>
-          <w:szCs w:val="24"/>
-          <w:u w:val="none"/>
-          <w:lang w:val="en-US"/>
-        </w:rPr>
-        <w:t>manager-&gt;StartRectEditor();</w:t>
-      </w:r>
-    </w:p>
-    <w:p>
-      <w:pPr>
-        <w:pStyle w:val="Normal"/>
-        <w:bidi w:val="0"/>
-        <w:spacing w:lineRule="exact" w:line="259" w:before="0" w:after="160"/>
-        <w:ind w:hanging="0" w:left="0" w:right="0"/>
-        <w:jc w:val="left"/>
-        <w:rPr>
-          <w:color w:val="000000"/>
-        </w:rPr>
-      </w:pPr>
-      <w:r>
-        <w:rPr>
-          <w:rFonts w:ascii="Times New Roman" w:hAnsi="Times New Roman"/>
-          <w:b w:val="false"/>
-          <w:bCs w:val="false"/>
-          <w:color w:val="000000"/>
-          <w:sz w:val="24"/>
-          <w:szCs w:val="24"/>
-          <w:u w:val="none"/>
-          <w:lang w:val="en-US"/>
-        </w:rPr>
-        <w:t xml:space="preserve">    </w:t>
-      </w:r>
-      <w:r>
-        <w:rPr>
-          <w:rFonts w:ascii="Times New Roman" w:hAnsi="Times New Roman"/>
-          <w:b w:val="false"/>
-          <w:bCs w:val="false"/>
-          <w:color w:val="000000"/>
-          <w:sz w:val="24"/>
-          <w:szCs w:val="24"/>
-          <w:u w:val="none"/>
-          <w:lang w:val="en-US"/>
-        </w:rPr>
-        <w:t>this-&gt;setWindowTitle("Поточний об'єкт: Прямокутник");</w:t>
-      </w:r>
-    </w:p>
-    <w:p>
-      <w:pPr>
-        <w:pStyle w:val="Normal"/>
-        <w:bidi w:val="0"/>
-        <w:spacing w:lineRule="exact" w:line="259" w:before="0" w:after="160"/>
-        <w:ind w:hanging="0" w:left="0" w:right="0"/>
-        <w:jc w:val="left"/>
-        <w:rPr>
-          <w:color w:val="000000"/>
-        </w:rPr>
-      </w:pPr>
-      <w:r>
-        <w:rPr>
-          <w:rFonts w:ascii="Times New Roman" w:hAnsi="Times New Roman"/>
-          <w:b w:val="false"/>
-          <w:bCs w:val="false"/>
-          <w:color w:val="000000"/>
-          <w:sz w:val="24"/>
-          <w:szCs w:val="24"/>
-          <w:u w:val="none"/>
-          <w:lang w:val="en-US"/>
-        </w:rPr>
-        <w:t>}</w:t>
-      </w:r>
-    </w:p>
-    <w:p>
-      <w:pPr>
-        <w:pStyle w:val="Normal"/>
-        <w:bidi w:val="0"/>
-        <w:spacing w:lineRule="exact" w:line="259" w:before="0" w:after="160"/>
-        <w:ind w:hanging="0" w:left="0" w:right="0"/>
-        <w:jc w:val="left"/>
-        <w:rPr>
-          <w:color w:val="000000"/>
-        </w:rPr>
-      </w:pPr>
-      <w:r>
-        <w:rPr>
-          <w:rFonts w:ascii="Times New Roman" w:hAnsi="Times New Roman"/>
-          <w:b w:val="false"/>
-          <w:bCs w:val="false"/>
-          <w:color w:val="000000"/>
-          <w:sz w:val="24"/>
-          <w:szCs w:val="24"/>
-          <w:u w:val="none"/>
-          <w:lang w:val="en-US"/>
-        </w:rPr>
-      </w:r>
-    </w:p>
-    <w:p>
-      <w:pPr>
-        <w:pStyle w:val="Normal"/>
-        <w:bidi w:val="0"/>
-        <w:spacing w:lineRule="exact" w:line="259" w:before="0" w:after="160"/>
-        <w:ind w:hanging="0" w:left="0" w:right="0"/>
-        <w:jc w:val="left"/>
-        <w:rPr>
-          <w:color w:val="000000"/>
-        </w:rPr>
-      </w:pPr>
-      <w:r>
-        <w:rPr>
-          <w:rFonts w:ascii="Times New Roman" w:hAnsi="Times New Roman"/>
-          <w:b w:val="false"/>
-          <w:bCs w:val="false"/>
-          <w:color w:val="000000"/>
-          <w:sz w:val="24"/>
-          <w:szCs w:val="24"/>
-          <w:u w:val="none"/>
-          <w:lang w:val="en-US"/>
-        </w:rPr>
-      </w:r>
-    </w:p>
-    <w:p>
-      <w:pPr>
-        <w:pStyle w:val="Normal"/>
-        <w:bidi w:val="0"/>
-        <w:spacing w:lineRule="exact" w:line="259" w:before="0" w:after="160"/>
-        <w:ind w:hanging="0" w:left="0" w:right="0"/>
-        <w:jc w:val="left"/>
-        <w:rPr>
-          <w:color w:val="000000"/>
-        </w:rPr>
-      </w:pPr>
-      <w:r>
-        <w:rPr>
-          <w:rFonts w:ascii="Times New Roman" w:hAnsi="Times New Roman"/>
-          <w:b w:val="false"/>
-          <w:bCs w:val="false"/>
-          <w:color w:val="000000"/>
-          <w:sz w:val="24"/>
-          <w:szCs w:val="24"/>
-          <w:u w:val="none"/>
-          <w:lang w:val="en-US"/>
-        </w:rPr>
-        <w:t>void MainWindow::on_ellipse_triggered()</w:t>
-      </w:r>
-    </w:p>
-    <w:p>
-      <w:pPr>
-        <w:pStyle w:val="Normal"/>
-        <w:bidi w:val="0"/>
-        <w:spacing w:lineRule="exact" w:line="259" w:before="0" w:after="160"/>
-        <w:ind w:hanging="0" w:left="0" w:right="0"/>
-        <w:jc w:val="left"/>
-        <w:rPr>
-          <w:color w:val="000000"/>
-        </w:rPr>
-      </w:pPr>
-      <w:r>
-        <w:rPr>
-          <w:rFonts w:ascii="Times New Roman" w:hAnsi="Times New Roman"/>
-          <w:b w:val="false"/>
-          <w:bCs w:val="false"/>
-          <w:color w:val="000000"/>
-          <w:sz w:val="24"/>
-          <w:szCs w:val="24"/>
-          <w:u w:val="none"/>
-          <w:lang w:val="en-US"/>
-        </w:rPr>
-        <w:t>{</w:t>
-      </w:r>
-    </w:p>
-    <w:p>
-      <w:pPr>
-        <w:pStyle w:val="Normal"/>
-        <w:bidi w:val="0"/>
-        <w:spacing w:lineRule="exact" w:line="259" w:before="0" w:after="160"/>
-        <w:ind w:hanging="0" w:left="0" w:right="0"/>
-        <w:jc w:val="left"/>
-        <w:rPr>
-          <w:color w:val="000000"/>
-        </w:rPr>
-      </w:pPr>
-      <w:r>
-        <w:rPr>
-          <w:rFonts w:ascii="Times New Roman" w:hAnsi="Times New Roman"/>
-          <w:b w:val="false"/>
-          <w:bCs w:val="false"/>
-          <w:color w:val="000000"/>
-          <w:sz w:val="24"/>
-          <w:szCs w:val="24"/>
-          <w:u w:val="none"/>
-          <w:lang w:val="en-US"/>
-        </w:rPr>
-        <w:t xml:space="preserve">    </w:t>
-      </w:r>
-      <w:r>
-        <w:rPr>
-          <w:rFonts w:ascii="Times New Roman" w:hAnsi="Times New Roman"/>
-          <w:b w:val="false"/>
-          <w:bCs w:val="false"/>
-          <w:color w:val="000000"/>
-          <w:sz w:val="24"/>
-          <w:szCs w:val="24"/>
-          <w:u w:val="none"/>
-          <w:lang w:val="en-US"/>
-        </w:rPr>
-        <w:t>manager-&gt;StartEllipseEditor();</w:t>
-      </w:r>
-    </w:p>
-    <w:p>
-      <w:pPr>
-        <w:pStyle w:val="Normal"/>
-        <w:bidi w:val="0"/>
-        <w:spacing w:lineRule="exact" w:line="259" w:before="0" w:after="160"/>
-        <w:ind w:hanging="0" w:left="0" w:right="0"/>
-        <w:jc w:val="left"/>
-        <w:rPr>
-          <w:color w:val="000000"/>
-        </w:rPr>
-      </w:pPr>
-      <w:r>
-        <w:rPr>
-          <w:rFonts w:ascii="Times New Roman" w:hAnsi="Times New Roman"/>
-          <w:b w:val="false"/>
-          <w:bCs w:val="false"/>
-          <w:color w:val="000000"/>
-          <w:sz w:val="24"/>
-          <w:szCs w:val="24"/>
-          <w:u w:val="none"/>
-          <w:lang w:val="en-US"/>
-        </w:rPr>
-        <w:t xml:space="preserve">    </w:t>
-      </w:r>
-      <w:r>
-        <w:rPr>
-          <w:rFonts w:ascii="Times New Roman" w:hAnsi="Times New Roman"/>
-          <w:b w:val="false"/>
-          <w:bCs w:val="false"/>
-          <w:color w:val="000000"/>
-          <w:sz w:val="24"/>
-          <w:szCs w:val="24"/>
-          <w:u w:val="none"/>
-          <w:lang w:val="en-US"/>
-        </w:rPr>
-        <w:t>this-&gt;setWindowTitle("Поточний об'єкт: Еліпс");</w:t>
-      </w:r>
-    </w:p>
-    <w:p>
-      <w:pPr>
-        <w:pStyle w:val="Normal"/>
-        <w:bidi w:val="0"/>
-        <w:spacing w:lineRule="exact" w:line="259" w:before="0" w:after="160"/>
-        <w:ind w:hanging="0" w:left="0" w:right="0"/>
-        <w:jc w:val="left"/>
-        <w:rPr>
-          <w:color w:val="000000"/>
-        </w:rPr>
-      </w:pPr>
-      <w:r>
-        <w:rPr>
-          <w:rFonts w:ascii="Times New Roman" w:hAnsi="Times New Roman"/>
-          <w:b w:val="false"/>
-          <w:bCs w:val="false"/>
-          <w:color w:val="000000"/>
-          <w:sz w:val="24"/>
-          <w:szCs w:val="24"/>
-          <w:u w:val="none"/>
-          <w:lang w:val="en-US"/>
-        </w:rPr>
-        <w:t>}</w:t>
-      </w:r>
-    </w:p>
-    <w:p>
-      <w:pPr>
-        <w:pStyle w:val="Normal"/>
-        <w:bidi w:val="0"/>
-        <w:spacing w:lineRule="exact" w:line="259" w:before="0" w:after="160"/>
-        <w:ind w:hanging="0" w:left="0" w:right="0"/>
-        <w:jc w:val="left"/>
-        <w:rPr>
-          <w:color w:val="000000"/>
-        </w:rPr>
-      </w:pPr>
-      <w:r>
-        <w:rPr>
-          <w:rFonts w:ascii="Times New Roman" w:hAnsi="Times New Roman"/>
-          <w:b w:val="false"/>
-          <w:bCs w:val="false"/>
-          <w:color w:val="000000"/>
-          <w:sz w:val="24"/>
-          <w:szCs w:val="24"/>
-          <w:u w:val="none"/>
-          <w:lang w:val="en-US"/>
-        </w:rPr>
-      </w:r>
-    </w:p>
-    <w:p>
-      <w:pPr>
-        <w:pStyle w:val="Normal"/>
-        <w:bidi w:val="0"/>
-        <w:spacing w:lineRule="exact" w:line="259" w:before="0" w:after="160"/>
-        <w:ind w:hanging="0" w:left="0" w:right="0"/>
-        <w:jc w:val="left"/>
-        <w:rPr>
-          <w:color w:val="000000"/>
-        </w:rPr>
-      </w:pPr>
-      <w:r>
-        <w:rPr>
-          <w:rFonts w:ascii="Times New Roman" w:hAnsi="Times New Roman"/>
-          <w:b w:val="false"/>
-          <w:bCs w:val="false"/>
-          <w:color w:val="000000"/>
-          <w:sz w:val="24"/>
-          <w:szCs w:val="24"/>
-          <w:u w:val="none"/>
-          <w:lang w:val="en-US"/>
-        </w:rPr>
-        <w:t>void MainWindow::on_point_triggered()</w:t>
-      </w:r>
-    </w:p>
-    <w:p>
-      <w:pPr>
-        <w:pStyle w:val="Normal"/>
-        <w:bidi w:val="0"/>
-        <w:spacing w:lineRule="exact" w:line="259" w:before="0" w:after="160"/>
-        <w:ind w:hanging="0" w:left="0" w:right="0"/>
-        <w:jc w:val="left"/>
-        <w:rPr>
-          <w:color w:val="000000"/>
-        </w:rPr>
-      </w:pPr>
-      <w:r>
-        <w:rPr>
-          <w:rFonts w:ascii="Times New Roman" w:hAnsi="Times New Roman"/>
-          <w:b w:val="false"/>
-          <w:bCs w:val="false"/>
-          <w:color w:val="000000"/>
-          <w:sz w:val="24"/>
-          <w:szCs w:val="24"/>
-          <w:u w:val="none"/>
-          <w:lang w:val="en-US"/>
-        </w:rPr>
-        <w:t>{</w:t>
-      </w:r>
-    </w:p>
-    <w:p>
-      <w:pPr>
-        <w:pStyle w:val="Normal"/>
-        <w:bidi w:val="0"/>
-        <w:spacing w:lineRule="exact" w:line="259" w:before="0" w:after="160"/>
-        <w:ind w:hanging="0" w:left="0" w:right="0"/>
-        <w:jc w:val="left"/>
-        <w:rPr>
-          <w:color w:val="000000"/>
-        </w:rPr>
-      </w:pPr>
-      <w:r>
-        <w:rPr>
-          <w:rFonts w:ascii="Times New Roman" w:hAnsi="Times New Roman"/>
-          <w:b w:val="false"/>
-          <w:bCs w:val="false"/>
-          <w:color w:val="000000"/>
-          <w:sz w:val="24"/>
-          <w:szCs w:val="24"/>
-          <w:u w:val="none"/>
-          <w:lang w:val="en-US"/>
-        </w:rPr>
-        <w:t xml:space="preserve">    </w:t>
-      </w:r>
-      <w:r>
-        <w:rPr>
-          <w:rFonts w:ascii="Times New Roman" w:hAnsi="Times New Roman"/>
-          <w:b w:val="false"/>
-          <w:bCs w:val="false"/>
-          <w:color w:val="000000"/>
-          <w:sz w:val="24"/>
-          <w:szCs w:val="24"/>
-          <w:u w:val="none"/>
-          <w:lang w:val="en-US"/>
-        </w:rPr>
-        <w:t>manager-&gt;StartPointEditor();</w:t>
-      </w:r>
-    </w:p>
-    <w:p>
-      <w:pPr>
-        <w:pStyle w:val="Normal"/>
-        <w:bidi w:val="0"/>
-        <w:spacing w:lineRule="exact" w:line="259" w:before="0" w:after="160"/>
-        <w:ind w:hanging="0" w:left="0" w:right="0"/>
-        <w:jc w:val="left"/>
-        <w:rPr>
-          <w:color w:val="000000"/>
-        </w:rPr>
-      </w:pPr>
-      <w:r>
-        <w:rPr>
-          <w:rFonts w:ascii="Times New Roman" w:hAnsi="Times New Roman"/>
-          <w:b w:val="false"/>
-          <w:bCs w:val="false"/>
-          <w:color w:val="000000"/>
-          <w:sz w:val="24"/>
-          <w:szCs w:val="24"/>
-          <w:u w:val="none"/>
-          <w:lang w:val="en-US"/>
-        </w:rPr>
-        <w:t xml:space="preserve">    </w:t>
-      </w:r>
-      <w:r>
-        <w:rPr>
-          <w:rFonts w:ascii="Times New Roman" w:hAnsi="Times New Roman"/>
-          <w:b w:val="false"/>
-          <w:bCs w:val="false"/>
-          <w:color w:val="000000"/>
-          <w:sz w:val="24"/>
-          <w:szCs w:val="24"/>
-          <w:u w:val="none"/>
-          <w:lang w:val="en-US"/>
-        </w:rPr>
-        <w:t>this-&gt;setWindowTitle("Поточний об'єкт: Крапка");</w:t>
-      </w:r>
-    </w:p>
-    <w:p>
-      <w:pPr>
-        <w:pStyle w:val="Normal"/>
-        <w:bidi w:val="0"/>
-        <w:spacing w:lineRule="exact" w:line="259" w:before="0" w:after="160"/>
-        <w:ind w:hanging="0" w:left="0" w:right="0"/>
-        <w:jc w:val="left"/>
-        <w:rPr>
-          <w:color w:val="000000"/>
-        </w:rPr>
-      </w:pPr>
-      <w:r>
-        <w:rPr>
-          <w:rFonts w:ascii="Times New Roman" w:hAnsi="Times New Roman"/>
-          <w:b w:val="false"/>
-          <w:bCs w:val="false"/>
-          <w:color w:val="000000"/>
-          <w:sz w:val="24"/>
-          <w:szCs w:val="24"/>
-          <w:u w:val="none"/>
-          <w:lang w:val="en-US"/>
-        </w:rPr>
-        <w:t>}</w:t>
-      </w:r>
-    </w:p>
-    <w:p>
-      <w:pPr>
-        <w:pStyle w:val="Normal"/>
-        <w:bidi w:val="0"/>
-        <w:spacing w:lineRule="exact" w:line="259" w:before="0" w:after="160"/>
-        <w:ind w:hanging="0" w:left="0" w:right="0"/>
-        <w:jc w:val="left"/>
-        <w:rPr>
-          <w:color w:val="000000"/>
-        </w:rPr>
-      </w:pPr>
-      <w:r>
-        <w:rPr>
-          <w:rFonts w:ascii="Times New Roman" w:hAnsi="Times New Roman"/>
-          <w:b w:val="false"/>
-          <w:bCs w:val="false"/>
-          <w:color w:val="000000"/>
-          <w:sz w:val="24"/>
-          <w:szCs w:val="24"/>
-          <w:u w:val="none"/>
-          <w:lang w:val="en-US"/>
-        </w:rPr>
-      </w:r>
-    </w:p>
-    <w:p>
-      <w:pPr>
-        <w:pStyle w:val="Normal"/>
-        <w:bidi w:val="0"/>
-        <w:spacing w:lineRule="exact" w:line="259" w:before="0" w:after="160"/>
-        <w:ind w:hanging="0" w:left="0" w:right="0"/>
-        <w:jc w:val="left"/>
-        <w:rPr>
-          <w:color w:val="000000"/>
-        </w:rPr>
-      </w:pPr>
-      <w:r>
-        <w:rPr>
-          <w:rFonts w:ascii="Times New Roman" w:hAnsi="Times New Roman"/>
-          <w:b w:val="false"/>
-          <w:bCs w:val="false"/>
-          <w:color w:val="000000"/>
-          <w:sz w:val="24"/>
-          <w:szCs w:val="24"/>
-          <w:u w:val="none"/>
-          <w:lang w:val="en-US"/>
-        </w:rPr>
-        <w:t>void MainWindow::on_back_triggered()</w:t>
-      </w:r>
-    </w:p>
-    <w:p>
-      <w:pPr>
-        <w:pStyle w:val="Normal"/>
-        <w:bidi w:val="0"/>
-        <w:spacing w:lineRule="exact" w:line="259" w:before="0" w:after="160"/>
-        <w:ind w:hanging="0" w:left="0" w:right="0"/>
-        <w:jc w:val="left"/>
-        <w:rPr>
-          <w:color w:val="000000"/>
-        </w:rPr>
-      </w:pPr>
-      <w:r>
-        <w:rPr>
-          <w:rFonts w:ascii="Times New Roman" w:hAnsi="Times New Roman"/>
-          <w:b w:val="false"/>
-          <w:bCs w:val="false"/>
-          <w:color w:val="000000"/>
-          <w:sz w:val="24"/>
-          <w:szCs w:val="24"/>
-          <w:u w:val="none"/>
-          <w:lang w:val="en-US"/>
-        </w:rPr>
-        <w:t>{</w:t>
-      </w:r>
-    </w:p>
-    <w:p>
-      <w:pPr>
-        <w:pStyle w:val="Normal"/>
-        <w:bidi w:val="0"/>
-        <w:spacing w:lineRule="exact" w:line="259" w:before="0" w:after="160"/>
-        <w:ind w:hanging="0" w:left="0" w:right="0"/>
-        <w:jc w:val="left"/>
-        <w:rPr>
-          <w:color w:val="000000"/>
-        </w:rPr>
-      </w:pPr>
-      <w:r>
-        <w:rPr>
-          <w:rFonts w:ascii="Times New Roman" w:hAnsi="Times New Roman"/>
-          <w:b w:val="false"/>
-          <w:bCs w:val="false"/>
-          <w:color w:val="000000"/>
-          <w:sz w:val="24"/>
-          <w:szCs w:val="24"/>
-          <w:u w:val="none"/>
-          <w:lang w:val="en-US"/>
-        </w:rPr>
-        <w:t xml:space="preserve">    </w:t>
-      </w:r>
-      <w:r>
-        <w:rPr>
-          <w:rFonts w:ascii="Times New Roman" w:hAnsi="Times New Roman"/>
-          <w:b w:val="false"/>
-          <w:bCs w:val="false"/>
-          <w:color w:val="000000"/>
-          <w:sz w:val="24"/>
-          <w:szCs w:val="24"/>
-          <w:u w:val="none"/>
-          <w:lang w:val="en-US"/>
-        </w:rPr>
-        <w:t>manager-&gt;RemoveLastShape();</w:t>
-      </w:r>
-    </w:p>
-    <w:p>
-      <w:pPr>
-        <w:pStyle w:val="Normal"/>
-        <w:bidi w:val="0"/>
-        <w:spacing w:lineRule="exact" w:line="259" w:before="0" w:after="160"/>
-        <w:ind w:hanging="0" w:left="0" w:right="0"/>
-        <w:jc w:val="left"/>
-        <w:rPr>
-          <w:color w:val="000000"/>
-        </w:rPr>
-      </w:pPr>
-      <w:r>
-        <w:rPr>
-          <w:rFonts w:ascii="Times New Roman" w:hAnsi="Times New Roman"/>
-          <w:b w:val="false"/>
-          <w:bCs w:val="false"/>
-          <w:color w:val="000000"/>
-          <w:sz w:val="24"/>
-          <w:szCs w:val="24"/>
-          <w:u w:val="none"/>
-          <w:lang w:val="en-US"/>
-        </w:rPr>
-        <w:t xml:space="preserve">    </w:t>
-      </w:r>
-      <w:r>
-        <w:rPr>
-          <w:rFonts w:ascii="Times New Roman" w:hAnsi="Times New Roman"/>
-          <w:b w:val="false"/>
-          <w:bCs w:val="false"/>
-          <w:color w:val="000000"/>
-          <w:sz w:val="24"/>
-          <w:szCs w:val="24"/>
-          <w:u w:val="none"/>
-          <w:lang w:val="en-US"/>
-        </w:rPr>
-        <w:t>update();</w:t>
-      </w:r>
-    </w:p>
-    <w:p>
-      <w:pPr>
-        <w:pStyle w:val="Normal"/>
-        <w:bidi w:val="0"/>
-        <w:spacing w:lineRule="exact" w:line="259" w:before="0" w:after="160"/>
-        <w:ind w:hanging="0" w:left="0" w:right="0"/>
-        <w:jc w:val="left"/>
-        <w:rPr>
-          <w:color w:val="000000"/>
-        </w:rPr>
-      </w:pPr>
-      <w:r>
-        <w:rPr>
-          <w:rFonts w:ascii="Times New Roman" w:hAnsi="Times New Roman"/>
-          <w:b w:val="false"/>
-          <w:bCs w:val="false"/>
-          <w:color w:val="000000"/>
-          <w:sz w:val="24"/>
-          <w:szCs w:val="24"/>
-          <w:u w:val="none"/>
-          <w:lang w:val="en-US"/>
-        </w:rPr>
-        <w:t>}</w:t>
-      </w:r>
-    </w:p>
-    <w:p>
-      <w:pPr>
-        <w:pStyle w:val="Normal"/>
-        <w:bidi w:val="0"/>
-        <w:spacing w:lineRule="exact" w:line="259" w:before="0" w:after="160"/>
-        <w:ind w:hanging="0" w:left="0" w:right="0"/>
-        <w:jc w:val="left"/>
-        <w:rPr>
-          <w:color w:val="000000"/>
-        </w:rPr>
-      </w:pPr>
-      <w:r>
-        <w:rPr>
-          <w:rFonts w:ascii="Times New Roman" w:hAnsi="Times New Roman"/>
-          <w:b w:val="false"/>
-          <w:bCs w:val="false"/>
-          <w:color w:val="000000"/>
-          <w:sz w:val="24"/>
-          <w:szCs w:val="24"/>
-          <w:u w:val="none"/>
-          <w:lang w:val="en-US"/>
-        </w:rPr>
-      </w:r>
-    </w:p>
-    <w:p>
-      <w:pPr>
-        <w:pStyle w:val="Normal"/>
-        <w:bidi w:val="0"/>
-        <w:spacing w:lineRule="exact" w:line="259" w:before="0" w:after="160"/>
-        <w:ind w:hanging="0" w:left="0" w:right="0"/>
-        <w:jc w:val="left"/>
-        <w:rPr>
-          <w:color w:val="000000"/>
-        </w:rPr>
-      </w:pPr>
-      <w:r>
-        <w:rPr>
-          <w:rFonts w:ascii="Times New Roman" w:hAnsi="Times New Roman"/>
-          <w:b w:val="false"/>
-          <w:bCs w:val="false"/>
-          <w:color w:val="000000"/>
-          <w:sz w:val="24"/>
-          <w:szCs w:val="24"/>
-          <w:u w:val="none"/>
-          <w:lang w:val="en-US"/>
-        </w:rPr>
-      </w:r>
-    </w:p>
-    <w:p>
-      <w:pPr>
-        <w:pStyle w:val="Normal"/>
-        <w:bidi w:val="0"/>
-        <w:spacing w:lineRule="exact" w:line="259" w:before="0" w:after="160"/>
-        <w:ind w:hanging="0" w:left="0" w:right="0"/>
-        <w:jc w:val="left"/>
-        <w:rPr>
-          <w:color w:val="000000"/>
-        </w:rPr>
-      </w:pPr>
-      <w:r>
-        <w:rPr>
-          <w:rFonts w:ascii="Times New Roman" w:hAnsi="Times New Roman"/>
-          <w:b w:val="false"/>
-          <w:bCs w:val="false"/>
-          <w:color w:val="000000"/>
-          <w:sz w:val="24"/>
-          <w:szCs w:val="24"/>
-          <w:u w:val="none"/>
-          <w:lang w:val="en-US"/>
-        </w:rPr>
-      </w:r>
-    </w:p>
-    <w:p>
-      <w:pPr>
-        <w:pStyle w:val="Normal"/>
-        <w:bidi w:val="0"/>
-        <w:spacing w:lineRule="exact" w:line="259" w:before="0" w:after="160"/>
-        <w:ind w:hanging="0" w:left="0" w:right="0"/>
-        <w:jc w:val="left"/>
-        <w:rPr>
-          <w:color w:val="000000"/>
-        </w:rPr>
-      </w:pPr>
-      <w:r>
-        <w:rPr>
-          <w:rFonts w:ascii="Times New Roman" w:hAnsi="Times New Roman"/>
-          <w:b w:val="false"/>
-          <w:bCs w:val="false"/>
-          <w:color w:val="000000"/>
-          <w:sz w:val="24"/>
-          <w:szCs w:val="24"/>
-          <w:u w:val="none"/>
-          <w:lang w:val="en-US"/>
-        </w:rPr>
-        <w:t>void MainWindow::on_color_triggered()</w:t>
-      </w:r>
-    </w:p>
-    <w:p>
-      <w:pPr>
-        <w:pStyle w:val="Normal"/>
-        <w:bidi w:val="0"/>
-        <w:spacing w:lineRule="exact" w:line="259" w:before="0" w:after="160"/>
-        <w:ind w:hanging="0" w:left="0" w:right="0"/>
-        <w:jc w:val="left"/>
-        <w:rPr>
-          <w:color w:val="000000"/>
-        </w:rPr>
-      </w:pPr>
-      <w:r>
-        <w:rPr>
-          <w:rFonts w:ascii="Times New Roman" w:hAnsi="Times New Roman"/>
-          <w:b w:val="false"/>
-          <w:bCs w:val="false"/>
-          <w:color w:val="000000"/>
-          <w:sz w:val="24"/>
-          <w:szCs w:val="24"/>
-          <w:u w:val="none"/>
-          <w:lang w:val="en-US"/>
-        </w:rPr>
-        <w:t>{</w:t>
-      </w:r>
-    </w:p>
-    <w:p>
-      <w:pPr>
-        <w:pStyle w:val="Normal"/>
-        <w:bidi w:val="0"/>
-        <w:spacing w:lineRule="exact" w:line="259" w:before="0" w:after="160"/>
-        <w:ind w:hanging="0" w:left="0" w:right="0"/>
-        <w:jc w:val="left"/>
-        <w:rPr>
-          <w:color w:val="000000"/>
-        </w:rPr>
-      </w:pPr>
-      <w:r>
-        <w:rPr>
-          <w:rFonts w:ascii="Times New Roman" w:hAnsi="Times New Roman"/>
-          <w:b w:val="false"/>
-          <w:bCs w:val="false"/>
-          <w:color w:val="000000"/>
-          <w:sz w:val="24"/>
-          <w:szCs w:val="24"/>
-          <w:u w:val="none"/>
-          <w:lang w:val="en-US"/>
-        </w:rPr>
-        <w:t xml:space="preserve">    </w:t>
-      </w:r>
-      <w:r>
-        <w:rPr>
-          <w:rFonts w:ascii="Times New Roman" w:hAnsi="Times New Roman"/>
-          <w:b w:val="false"/>
-          <w:bCs w:val="false"/>
-          <w:color w:val="000000"/>
-          <w:sz w:val="24"/>
-          <w:szCs w:val="24"/>
-          <w:u w:val="none"/>
-          <w:lang w:val="en-US"/>
-        </w:rPr>
-        <w:t>QColor chosenColor = QColorDialog::getColor(Qt::black, nullptr,"Виберіть колір");</w:t>
-      </w:r>
-    </w:p>
-    <w:p>
-      <w:pPr>
-        <w:pStyle w:val="Normal"/>
-        <w:bidi w:val="0"/>
-        <w:spacing w:lineRule="exact" w:line="259" w:before="0" w:after="160"/>
-        <w:ind w:hanging="0" w:left="0" w:right="0"/>
-        <w:jc w:val="left"/>
-        <w:rPr>
-          <w:color w:val="000000"/>
-        </w:rPr>
-      </w:pPr>
-      <w:r>
-        <w:rPr>
-          <w:rFonts w:ascii="Times New Roman" w:hAnsi="Times New Roman"/>
-          <w:b w:val="false"/>
-          <w:bCs w:val="false"/>
-          <w:color w:val="000000"/>
-          <w:sz w:val="24"/>
-          <w:szCs w:val="24"/>
-          <w:u w:val="none"/>
-          <w:lang w:val="en-US"/>
-        </w:rPr>
-        <w:t xml:space="preserve">    </w:t>
-      </w:r>
-      <w:r>
-        <w:rPr>
-          <w:rFonts w:ascii="Times New Roman" w:hAnsi="Times New Roman"/>
-          <w:b w:val="false"/>
-          <w:bCs w:val="false"/>
-          <w:color w:val="000000"/>
-          <w:sz w:val="24"/>
-          <w:szCs w:val="24"/>
-          <w:u w:val="none"/>
-          <w:lang w:val="en-US"/>
-        </w:rPr>
-        <w:t>if(chosenColor.isValid()) {</w:t>
-      </w:r>
-    </w:p>
-    <w:p>
-      <w:pPr>
-        <w:pStyle w:val="Normal"/>
-        <w:bidi w:val="0"/>
-        <w:spacing w:lineRule="exact" w:line="259" w:before="0" w:after="160"/>
-        <w:ind w:hanging="0" w:left="0" w:right="0"/>
-        <w:jc w:val="left"/>
-        <w:rPr>
-          <w:color w:val="000000"/>
-        </w:rPr>
-      </w:pPr>
-      <w:r>
-        <w:rPr>
-          <w:rFonts w:ascii="Times New Roman" w:hAnsi="Times New Roman"/>
-          <w:b w:val="false"/>
-          <w:bCs w:val="false"/>
-          <w:color w:val="000000"/>
-          <w:sz w:val="24"/>
-          <w:szCs w:val="24"/>
-          <w:u w:val="none"/>
-          <w:lang w:val="en-US"/>
-        </w:rPr>
-        <w:t xml:space="preserve">        </w:t>
-      </w:r>
-      <w:r>
-        <w:rPr>
-          <w:rFonts w:ascii="Times New Roman" w:hAnsi="Times New Roman"/>
-          <w:b w:val="false"/>
-          <w:bCs w:val="false"/>
-          <w:color w:val="000000"/>
-          <w:sz w:val="24"/>
-          <w:szCs w:val="24"/>
-          <w:u w:val="none"/>
-          <w:lang w:val="en-US"/>
-        </w:rPr>
-        <w:t>manager-&gt;setCurrentColor(chosenColor);</w:t>
-      </w:r>
-    </w:p>
-    <w:p>
-      <w:pPr>
-        <w:pStyle w:val="Normal"/>
-        <w:bidi w:val="0"/>
-        <w:spacing w:lineRule="exact" w:line="259" w:before="0" w:after="160"/>
-        <w:ind w:hanging="0" w:left="0" w:right="0"/>
-        <w:jc w:val="left"/>
-        <w:rPr>
-          <w:color w:val="000000"/>
-        </w:rPr>
-      </w:pPr>
-      <w:r>
-        <w:rPr>
-          <w:rFonts w:ascii="Times New Roman" w:hAnsi="Times New Roman"/>
-          <w:b w:val="false"/>
-          <w:bCs w:val="false"/>
-          <w:color w:val="000000"/>
-          <w:sz w:val="24"/>
-          <w:szCs w:val="24"/>
-          <w:u w:val="none"/>
-          <w:lang w:val="en-US"/>
-        </w:rPr>
-        <w:t xml:space="preserve">    </w:t>
-      </w:r>
-      <w:r>
-        <w:rPr>
-          <w:rFonts w:ascii="Times New Roman" w:hAnsi="Times New Roman"/>
-          <w:b w:val="false"/>
-          <w:bCs w:val="false"/>
-          <w:color w:val="000000"/>
-          <w:sz w:val="24"/>
-          <w:szCs w:val="24"/>
-          <w:u w:val="none"/>
-          <w:lang w:val="en-US"/>
-        </w:rPr>
-        <w:t>}</w:t>
-      </w:r>
-    </w:p>
-    <w:p>
-      <w:pPr>
-        <w:pStyle w:val="Normal"/>
-        <w:bidi w:val="0"/>
-        <w:spacing w:lineRule="exact" w:line="259" w:before="0" w:after="160"/>
-        <w:ind w:hanging="0" w:left="0" w:right="0"/>
-        <w:jc w:val="left"/>
-        <w:rPr>
-          <w:color w:val="000000"/>
-        </w:rPr>
-      </w:pPr>
-      <w:r>
-        <w:rPr>
-          <w:rFonts w:ascii="Times New Roman" w:hAnsi="Times New Roman"/>
-          <w:b w:val="false"/>
-          <w:bCs w:val="false"/>
-          <w:color w:val="000000"/>
-          <w:sz w:val="24"/>
-          <w:szCs w:val="24"/>
-          <w:u w:val="none"/>
-          <w:lang w:val="en-US"/>
-        </w:rPr>
-      </w:r>
-    </w:p>
-    <w:p>
-      <w:pPr>
-        <w:pStyle w:val="Normal"/>
-        <w:bidi w:val="0"/>
-        <w:spacing w:lineRule="exact" w:line="259" w:before="0" w:after="160"/>
-        <w:ind w:hanging="0" w:left="0" w:right="0"/>
-        <w:jc w:val="left"/>
-        <w:rPr>
-          <w:color w:val="000000"/>
-        </w:rPr>
-      </w:pPr>
-      <w:r>
-        <w:rPr>
-          <w:rFonts w:ascii="Times New Roman" w:hAnsi="Times New Roman"/>
-          <w:b w:val="false"/>
-          <w:bCs w:val="false"/>
-          <w:color w:val="000000"/>
-          <w:sz w:val="24"/>
-          <w:szCs w:val="24"/>
-          <w:u w:val="none"/>
-          <w:lang w:val="en-US"/>
-        </w:rPr>
-        <w:t>}</w:t>
-      </w:r>
-    </w:p>
-    <w:p>
-      <w:pPr>
-        <w:pStyle w:val="Normal"/>
-        <w:bidi w:val="0"/>
-        <w:spacing w:lineRule="exact" w:line="259" w:before="0" w:after="160"/>
-        <w:ind w:hanging="0" w:left="0" w:right="0"/>
-        <w:jc w:val="left"/>
-        <w:rPr>
-          <w:rFonts w:ascii="Times New Roman" w:hAnsi="Times New Roman"/>
-          <w:b w:val="false"/>
-          <w:bCs w:val="false"/>
-          <w:color w:val="000000"/>
-          <w:sz w:val="24"/>
-          <w:szCs w:val="24"/>
-          <w:u w:val="none"/>
-          <w:lang w:val="en-US"/>
-        </w:rPr>
-      </w:pPr>
-      <w:r>
-        <w:rPr>
-          <w:rFonts w:ascii="Times New Roman" w:hAnsi="Times New Roman"/>
-          <w:b w:val="false"/>
-          <w:bCs w:val="false"/>
-          <w:color w:val="000000"/>
-          <w:sz w:val="24"/>
-          <w:szCs w:val="24"/>
-          <w:u w:val="none"/>
-          <w:lang w:val="en-US"/>
-        </w:rPr>
-      </w:r>
-    </w:p>
-    <w:p>
-      <w:pPr>
-        <w:pStyle w:val="Normal"/>
-        <w:bidi w:val="0"/>
-        <w:spacing w:lineRule="exact" w:line="259" w:before="0" w:after="160"/>
-        <w:ind w:hanging="0" w:left="0" w:right="0"/>
-        <w:jc w:val="left"/>
-        <w:rPr>
-          <w:color w:val="000000"/>
-        </w:rPr>
-      </w:pPr>
-      <w:r>
-        <w:rPr/>
+          <w:color w:val="000000"/>
+        </w:rPr>
       </w:r>
     </w:p>
     <w:p>
@@ -3705,10 +3938,7 @@
       </w:pPr>
       <w:r>
         <w:rPr>
-          <w:rFonts w:ascii="Times New Roman" w:hAnsi="Times New Roman"/>
-          <w:color w:val="000000"/>
-          <w:sz w:val="24"/>
-          <w:szCs w:val="24"/>
+          <w:color w:val="000000"/>
         </w:rPr>
       </w:r>
     </w:p>
@@ -3809,10 +4039,7 @@
       </w:pPr>
       <w:r>
         <w:rPr>
-          <w:rFonts w:ascii="Times New Roman" w:hAnsi="Times New Roman"/>
-          <w:color w:val="000000"/>
-          <w:sz w:val="24"/>
-          <w:szCs w:val="24"/>
+          <w:color w:val="000000"/>
         </w:rPr>
       </w:r>
     </w:p>
@@ -3892,10 +4119,7 @@
       </w:pPr>
       <w:r>
         <w:rPr>
-          <w:rFonts w:ascii="Times New Roman" w:hAnsi="Times New Roman"/>
-          <w:color w:val="000000"/>
-          <w:sz w:val="24"/>
-          <w:szCs w:val="24"/>
+          <w:color w:val="000000"/>
         </w:rPr>
       </w:r>
     </w:p>
@@ -3984,10 +4208,7 @@
       </w:pPr>
       <w:r>
         <w:rPr>
-          <w:rFonts w:ascii="Times New Roman" w:hAnsi="Times New Roman"/>
-          <w:color w:val="000000"/>
-          <w:sz w:val="24"/>
-          <w:szCs w:val="24"/>
+          <w:color w:val="000000"/>
         </w:rPr>
       </w:r>
     </w:p>
@@ -4106,10 +4327,7 @@
       </w:pPr>
       <w:r>
         <w:rPr>
-          <w:rFonts w:ascii="Times New Roman" w:hAnsi="Times New Roman"/>
-          <w:color w:val="000000"/>
-          <w:sz w:val="24"/>
-          <w:szCs w:val="24"/>
+          <w:color w:val="000000"/>
         </w:rPr>
       </w:r>
     </w:p>
@@ -4156,10 +4374,7 @@
       </w:pPr>
       <w:r>
         <w:rPr>
-          <w:rFonts w:ascii="Times New Roman" w:hAnsi="Times New Roman"/>
-          <w:color w:val="000000"/>
-          <w:sz w:val="24"/>
-          <w:szCs w:val="24"/>
+          <w:color w:val="000000"/>
         </w:rPr>
       </w:r>
     </w:p>
@@ -4206,10 +4421,7 @@
       </w:pPr>
       <w:r>
         <w:rPr>
-          <w:rFonts w:ascii="Times New Roman" w:hAnsi="Times New Roman"/>
-          <w:color w:val="000000"/>
-          <w:sz w:val="24"/>
-          <w:szCs w:val="24"/>
+          <w:color w:val="000000"/>
         </w:rPr>
       </w:r>
     </w:p>
@@ -4256,10 +4468,7 @@
       </w:pPr>
       <w:r>
         <w:rPr>
-          <w:rFonts w:ascii="Times New Roman" w:hAnsi="Times New Roman"/>
-          <w:color w:val="000000"/>
-          <w:sz w:val="24"/>
-          <w:szCs w:val="24"/>
+          <w:color w:val="000000"/>
         </w:rPr>
       </w:r>
     </w:p>
@@ -4306,10 +4515,7 @@
       </w:pPr>
       <w:r>
         <w:rPr>
-          <w:rFonts w:ascii="Times New Roman" w:hAnsi="Times New Roman"/>
-          <w:color w:val="000000"/>
-          <w:sz w:val="24"/>
-          <w:szCs w:val="24"/>
+          <w:color w:val="000000"/>
         </w:rPr>
       </w:r>
     </w:p>
@@ -4356,10 +4562,7 @@
       </w:pPr>
       <w:r>
         <w:rPr>
-          <w:rFonts w:ascii="Times New Roman" w:hAnsi="Times New Roman"/>
-          <w:color w:val="000000"/>
-          <w:sz w:val="24"/>
-          <w:szCs w:val="24"/>
+          <w:color w:val="000000"/>
         </w:rPr>
       </w:r>
     </w:p>
@@ -4406,10 +4609,7 @@
       </w:pPr>
       <w:r>
         <w:rPr>
-          <w:rFonts w:ascii="Times New Roman" w:hAnsi="Times New Roman"/>
-          <w:color w:val="000000"/>
-          <w:sz w:val="24"/>
-          <w:szCs w:val="24"/>
+          <w:color w:val="000000"/>
         </w:rPr>
       </w:r>
     </w:p>
@@ -13504,12 +13704,7 @@
       </w:pPr>
       <w:r>
         <w:rPr>
-          <w:rFonts w:ascii="Times New Roman" w:hAnsi="Times New Roman"/>
-          <w:b w:val="false"/>
-          <w:bCs w:val="false"/>
-          <w:color w:val="000000"/>
-          <w:sz w:val="24"/>
-          <w:szCs w:val="24"/>
+          <w:color w:val="000000"/>
         </w:rPr>
       </w:r>
     </w:p>
@@ -15211,16 +15406,66 @@
           <w:sz w:val="32"/>
           <w:u w:val="single"/>
         </w:rPr>
+      </w:r>
+    </w:p>
+    <w:p>
+      <w:pPr>
+        <w:pStyle w:val="Normal"/>
+        <w:bidi w:val="0"/>
+        <w:spacing w:lineRule="exact" w:line="259" w:before="0" w:after="160"/>
+        <w:ind w:hanging="0" w:left="0" w:right="0"/>
+        <w:jc w:val="left"/>
+        <w:rPr>
+          <w:rFonts w:ascii="Times New Roman" w:hAnsi="Times New Roman" w:eastAsia="Times New Roman" w:cs="Times New Roman"/>
+          <w:color w:val="000000"/>
+          <w:spacing w:val="0"/>
+          <w:sz w:val="32"/>
+          <w:u w:val="single"/>
+        </w:rPr>
+      </w:pPr>
+      <w:r>
+        <w:rPr>
+          <w:rFonts w:eastAsia="Times New Roman" w:cs="Times New Roman" w:ascii="Times New Roman" w:hAnsi="Times New Roman"/>
+          <w:color w:val="000000"/>
+          <w:spacing w:val="0"/>
+          <w:sz w:val="32"/>
+          <w:u w:val="single"/>
+        </w:rPr>
+      </w:r>
+    </w:p>
+    <w:p>
+      <w:pPr>
+        <w:pStyle w:val="Normal"/>
+        <w:bidi w:val="0"/>
+        <w:spacing w:lineRule="exact" w:line="259" w:before="0" w:after="160"/>
+        <w:ind w:hanging="0" w:left="0" w:right="0"/>
+        <w:jc w:val="left"/>
+        <w:rPr>
+          <w:rFonts w:ascii="Times New Roman" w:hAnsi="Times New Roman" w:eastAsia="Times New Roman" w:cs="Times New Roman"/>
+          <w:color w:val="000000"/>
+          <w:spacing w:val="0"/>
+          <w:sz w:val="32"/>
+          <w:u w:val="single"/>
+        </w:rPr>
+      </w:pPr>
+      <w:r>
+        <w:rPr>
+          <w:rFonts w:eastAsia="Times New Roman" w:cs="Times New Roman" w:ascii="Times New Roman" w:hAnsi="Times New Roman"/>
+          <w:color w:val="000000"/>
+          <w:spacing w:val="0"/>
+          <w:sz w:val="32"/>
+          <w:u w:val="single"/>
+        </w:rPr>
         <w:drawing>
-          <wp:anchor behindDoc="0" distT="0" distB="0" distL="0" distR="0" simplePos="0" locked="0" layoutInCell="0" allowOverlap="1" relativeHeight="2">
+          <wp:anchor behindDoc="0" distT="0" distB="0" distL="0" distR="0" simplePos="0" locked="0" layoutInCell="0" allowOverlap="1" relativeHeight="3">
             <wp:simplePos x="0" y="0"/>
             <wp:positionH relativeFrom="column">
-              <wp:posOffset>84455</wp:posOffset>
+              <wp:align>center</wp:align>
             </wp:positionH>
             <wp:positionV relativeFrom="paragraph">
-              <wp:posOffset>-120650</wp:posOffset>
+              <wp:posOffset>635</wp:posOffset>
             </wp:positionV>
-            <wp:extent cx="5943600" cy="1426210"/>
+            <wp:extent cx="5943600" cy="4319270"/>
             <wp:effectExtent l="0" t="0" r="0" b="0"/>
             <wp:wrapSquare wrapText="largest"/>
             <wp:docPr id="1" name="Зображення1" descr=""/>
@@ -15245,7 +15490,7 @@
                   <pic:spPr bwMode="auto">
                     <a:xfrm>
                       <a:off x="0" y="0"/>
-                      <a:ext cx="5943600" cy="1426210"/>
+                      <a:ext cx="5943600" cy="4319270"/>
                     </a:xfrm>
                     <a:prstGeom prst="rect">
                       <a:avLst/>
@@ -15332,8 +15577,208 @@
           <w:sz w:val="32"/>
           <w:u w:val="single"/>
         </w:rPr>
+      </w:r>
+    </w:p>
+    <w:p>
+      <w:pPr>
+        <w:pStyle w:val="Normal"/>
+        <w:bidi w:val="0"/>
+        <w:spacing w:lineRule="exact" w:line="259" w:before="0" w:after="160"/>
+        <w:ind w:hanging="0" w:left="0" w:right="0"/>
+        <w:jc w:val="left"/>
+        <w:rPr>
+          <w:rFonts w:ascii="Times New Roman" w:hAnsi="Times New Roman" w:eastAsia="Times New Roman" w:cs="Times New Roman"/>
+          <w:color w:val="000000"/>
+          <w:spacing w:val="0"/>
+          <w:sz w:val="32"/>
+          <w:u w:val="single"/>
+        </w:rPr>
+      </w:pPr>
+      <w:r>
+        <w:rPr>
+          <w:rFonts w:eastAsia="Times New Roman" w:cs="Times New Roman" w:ascii="Times New Roman" w:hAnsi="Times New Roman"/>
+          <w:color w:val="000000"/>
+          <w:spacing w:val="0"/>
+          <w:sz w:val="32"/>
+          <w:u w:val="single"/>
+        </w:rPr>
+      </w:r>
+    </w:p>
+    <w:p>
+      <w:pPr>
+        <w:pStyle w:val="Normal"/>
+        <w:bidi w:val="0"/>
+        <w:spacing w:lineRule="exact" w:line="259" w:before="0" w:after="160"/>
+        <w:ind w:hanging="0" w:left="0" w:right="0"/>
+        <w:jc w:val="left"/>
+        <w:rPr>
+          <w:rFonts w:ascii="Times New Roman" w:hAnsi="Times New Roman" w:eastAsia="Times New Roman" w:cs="Times New Roman"/>
+          <w:color w:val="000000"/>
+          <w:spacing w:val="0"/>
+          <w:sz w:val="32"/>
+          <w:u w:val="single"/>
+        </w:rPr>
+      </w:pPr>
+      <w:r>
+        <w:rPr>
+          <w:rFonts w:eastAsia="Times New Roman" w:cs="Times New Roman" w:ascii="Times New Roman" w:hAnsi="Times New Roman"/>
+          <w:color w:val="000000"/>
+          <w:spacing w:val="0"/>
+          <w:sz w:val="32"/>
+          <w:u w:val="single"/>
+        </w:rPr>
+      </w:r>
+    </w:p>
+    <w:p>
+      <w:pPr>
+        <w:pStyle w:val="Normal"/>
+        <w:bidi w:val="0"/>
+        <w:spacing w:lineRule="exact" w:line="259" w:before="0" w:after="160"/>
+        <w:ind w:hanging="0" w:left="0" w:right="0"/>
+        <w:jc w:val="left"/>
+        <w:rPr>
+          <w:rFonts w:ascii="Times New Roman" w:hAnsi="Times New Roman" w:eastAsia="Times New Roman" w:cs="Times New Roman"/>
+          <w:color w:val="000000"/>
+          <w:spacing w:val="0"/>
+          <w:sz w:val="32"/>
+          <w:u w:val="single"/>
+        </w:rPr>
+      </w:pPr>
+      <w:r>
+        <w:rPr>
+          <w:rFonts w:eastAsia="Times New Roman" w:cs="Times New Roman" w:ascii="Times New Roman" w:hAnsi="Times New Roman"/>
+          <w:color w:val="000000"/>
+          <w:spacing w:val="0"/>
+          <w:sz w:val="32"/>
+          <w:u w:val="single"/>
+        </w:rPr>
+      </w:r>
+    </w:p>
+    <w:p>
+      <w:pPr>
+        <w:pStyle w:val="Normal"/>
+        <w:bidi w:val="0"/>
+        <w:spacing w:lineRule="exact" w:line="259" w:before="0" w:after="160"/>
+        <w:ind w:hanging="0" w:left="0" w:right="0"/>
+        <w:jc w:val="left"/>
+        <w:rPr>
+          <w:rFonts w:ascii="Times New Roman" w:hAnsi="Times New Roman" w:eastAsia="Times New Roman" w:cs="Times New Roman"/>
+          <w:color w:val="000000"/>
+          <w:spacing w:val="0"/>
+          <w:sz w:val="32"/>
+          <w:u w:val="single"/>
+        </w:rPr>
+      </w:pPr>
+      <w:r>
+        <w:rPr>
+          <w:rFonts w:eastAsia="Times New Roman" w:cs="Times New Roman" w:ascii="Times New Roman" w:hAnsi="Times New Roman"/>
+          <w:color w:val="000000"/>
+          <w:spacing w:val="0"/>
+          <w:sz w:val="32"/>
+          <w:u w:val="single"/>
+        </w:rPr>
+      </w:r>
+    </w:p>
+    <w:p>
+      <w:pPr>
+        <w:pStyle w:val="Normal"/>
+        <w:bidi w:val="0"/>
+        <w:spacing w:lineRule="exact" w:line="259" w:before="0" w:after="160"/>
+        <w:ind w:hanging="0" w:left="0" w:right="0"/>
+        <w:jc w:val="left"/>
+        <w:rPr>
+          <w:rFonts w:ascii="Times New Roman" w:hAnsi="Times New Roman" w:eastAsia="Times New Roman" w:cs="Times New Roman"/>
+          <w:color w:val="000000"/>
+          <w:spacing w:val="0"/>
+          <w:sz w:val="32"/>
+          <w:u w:val="single"/>
+        </w:rPr>
+      </w:pPr>
+      <w:r>
+        <w:rPr>
+          <w:rFonts w:eastAsia="Times New Roman" w:cs="Times New Roman" w:ascii="Times New Roman" w:hAnsi="Times New Roman"/>
+          <w:color w:val="000000"/>
+          <w:spacing w:val="0"/>
+          <w:sz w:val="32"/>
+          <w:u w:val="single"/>
+        </w:rPr>
+      </w:r>
+    </w:p>
+    <w:p>
+      <w:pPr>
+        <w:pStyle w:val="Normal"/>
+        <w:bidi w:val="0"/>
+        <w:spacing w:lineRule="exact" w:line="259" w:before="0" w:after="160"/>
+        <w:ind w:hanging="0" w:left="0" w:right="0"/>
+        <w:jc w:val="left"/>
+        <w:rPr>
+          <w:rFonts w:ascii="Times New Roman" w:hAnsi="Times New Roman" w:eastAsia="Times New Roman" w:cs="Times New Roman"/>
+          <w:color w:val="000000"/>
+          <w:spacing w:val="0"/>
+          <w:sz w:val="32"/>
+          <w:u w:val="single"/>
+        </w:rPr>
+      </w:pPr>
+      <w:r>
+        <w:rPr>
+          <w:rFonts w:eastAsia="Times New Roman" w:cs="Times New Roman" w:ascii="Times New Roman" w:hAnsi="Times New Roman"/>
+          <w:color w:val="000000"/>
+          <w:spacing w:val="0"/>
+          <w:sz w:val="32"/>
+          <w:u w:val="single"/>
+        </w:rPr>
+      </w:r>
+    </w:p>
+    <w:p>
+      <w:pPr>
+        <w:pStyle w:val="Normal"/>
+        <w:bidi w:val="0"/>
+        <w:spacing w:lineRule="exact" w:line="259" w:before="0" w:after="160"/>
+        <w:ind w:hanging="0" w:left="0" w:right="0"/>
+        <w:jc w:val="left"/>
+        <w:rPr>
+          <w:rFonts w:ascii="Times New Roman" w:hAnsi="Times New Roman" w:eastAsia="Times New Roman" w:cs="Times New Roman"/>
+          <w:color w:val="000000"/>
+          <w:spacing w:val="0"/>
+          <w:sz w:val="32"/>
+          <w:u w:val="single"/>
+        </w:rPr>
+      </w:pPr>
+      <w:r>
+        <w:rPr>
+          <w:rFonts w:eastAsia="Times New Roman" w:cs="Times New Roman" w:ascii="Times New Roman" w:hAnsi="Times New Roman"/>
+          <w:color w:val="000000"/>
+          <w:spacing w:val="0"/>
+          <w:sz w:val="32"/>
+          <w:u w:val="single"/>
+        </w:rPr>
+      </w:r>
+    </w:p>
+    <w:p>
+      <w:pPr>
+        <w:pStyle w:val="Normal"/>
+        <w:bidi w:val="0"/>
+        <w:spacing w:lineRule="exact" w:line="259" w:before="0" w:after="160"/>
+        <w:ind w:hanging="0" w:left="0" w:right="0"/>
+        <w:jc w:val="left"/>
+        <w:rPr>
+          <w:rFonts w:ascii="Times New Roman" w:hAnsi="Times New Roman" w:eastAsia="Times New Roman" w:cs="Times New Roman"/>
+          <w:color w:val="000000"/>
+          <w:spacing w:val="0"/>
+          <w:sz w:val="32"/>
+          <w:u w:val="single"/>
+        </w:rPr>
+      </w:pPr>
+      <w:r>
+        <w:rPr>
+          <w:rFonts w:eastAsia="Times New Roman" w:cs="Times New Roman" w:ascii="Times New Roman" w:hAnsi="Times New Roman"/>
+          <w:color w:val="000000"/>
+          <w:spacing w:val="0"/>
+          <w:sz w:val="32"/>
+          <w:u w:val="single"/>
+        </w:rPr>
         <w:drawing>
-          <wp:anchor behindDoc="0" distT="0" distB="0" distL="0" distR="0" simplePos="0" locked="0" layoutInCell="0" allowOverlap="1" relativeHeight="3">
+          <wp:anchor behindDoc="0" distT="0" distB="0" distL="0" distR="0" simplePos="0" locked="0" layoutInCell="0" allowOverlap="1" relativeHeight="4">
             <wp:simplePos x="0" y="0"/>
             <wp:positionH relativeFrom="column">
               <wp:align>center</wp:align>
@@ -15341,7 +15786,7 @@
             <wp:positionV relativeFrom="paragraph">
               <wp:posOffset>635</wp:posOffset>
             </wp:positionV>
-            <wp:extent cx="5943600" cy="3096895"/>
+            <wp:extent cx="5943600" cy="3986530"/>
             <wp:effectExtent l="0" t="0" r="0" b="0"/>
             <wp:wrapSquare wrapText="largest"/>
             <wp:docPr id="2" name="Зображення2" descr=""/>
@@ -15366,7 +15811,7 @@
                   <pic:spPr bwMode="auto">
                     <a:xfrm>
                       <a:off x="0" y="0"/>
-                      <a:ext cx="5943600" cy="3096895"/>
+                      <a:ext cx="5943600" cy="3986530"/>
                     </a:xfrm>
                     <a:prstGeom prst="rect">
                       <a:avLst/>
@@ -15403,58 +15848,8 @@
           <w:sz w:val="32"/>
           <w:u w:val="single"/>
         </w:rPr>
-      </w:r>
-    </w:p>
-    <w:p>
-      <w:pPr>
-        <w:pStyle w:val="Normal"/>
-        <w:bidi w:val="0"/>
-        <w:spacing w:lineRule="exact" w:line="259" w:before="0" w:after="160"/>
-        <w:ind w:hanging="0" w:left="0" w:right="0"/>
-        <w:jc w:val="left"/>
-        <w:rPr>
-          <w:rFonts w:ascii="Times New Roman" w:hAnsi="Times New Roman" w:eastAsia="Times New Roman" w:cs="Times New Roman"/>
-          <w:color w:val="000000"/>
-          <w:spacing w:val="0"/>
-          <w:sz w:val="32"/>
-          <w:u w:val="single"/>
-        </w:rPr>
-      </w:pPr>
-      <w:r>
-        <w:rPr>
-          <w:rFonts w:eastAsia="Times New Roman" w:cs="Times New Roman" w:ascii="Times New Roman" w:hAnsi="Times New Roman"/>
-          <w:color w:val="000000"/>
-          <w:spacing w:val="0"/>
-          <w:sz w:val="32"/>
-          <w:u w:val="single"/>
-        </w:rPr>
-      </w:r>
-    </w:p>
-    <w:p>
-      <w:pPr>
-        <w:pStyle w:val="Normal"/>
-        <w:bidi w:val="0"/>
-        <w:spacing w:lineRule="exact" w:line="259" w:before="0" w:after="160"/>
-        <w:ind w:hanging="0" w:left="0" w:right="0"/>
-        <w:jc w:val="left"/>
-        <w:rPr>
-          <w:rFonts w:ascii="Times New Roman" w:hAnsi="Times New Roman" w:eastAsia="Times New Roman" w:cs="Times New Roman"/>
-          <w:color w:val="000000"/>
-          <w:spacing w:val="0"/>
-          <w:sz w:val="32"/>
-          <w:u w:val="single"/>
-        </w:rPr>
-      </w:pPr>
-      <w:r>
-        <w:rPr>
-          <w:rFonts w:eastAsia="Times New Roman" w:cs="Times New Roman" w:ascii="Times New Roman" w:hAnsi="Times New Roman"/>
-          <w:color w:val="000000"/>
-          <w:spacing w:val="0"/>
-          <w:sz w:val="32"/>
-          <w:u w:val="single"/>
-        </w:rPr>
         <w:drawing>
-          <wp:anchor behindDoc="0" distT="0" distB="0" distL="0" distR="0" simplePos="0" locked="0" layoutInCell="0" allowOverlap="1" relativeHeight="4">
+          <wp:anchor behindDoc="0" distT="0" distB="0" distL="0" distR="0" simplePos="0" locked="0" layoutInCell="0" allowOverlap="1" relativeHeight="5">
             <wp:simplePos x="0" y="0"/>
             <wp:positionH relativeFrom="column">
               <wp:align>center</wp:align>
@@ -15462,7 +15857,7 @@
             <wp:positionV relativeFrom="paragraph">
               <wp:posOffset>635</wp:posOffset>
             </wp:positionV>
-            <wp:extent cx="5943600" cy="4034155"/>
+            <wp:extent cx="5943600" cy="3913505"/>
             <wp:effectExtent l="0" t="0" r="0" b="0"/>
             <wp:wrapSquare wrapText="largest"/>
             <wp:docPr id="3" name="Зображення3" descr=""/>
@@ -15487,7 +15882,7 @@
                   <pic:spPr bwMode="auto">
                     <a:xfrm>
                       <a:off x="0" y="0"/>
-                      <a:ext cx="5943600" cy="4034155"/>
+                      <a:ext cx="5943600" cy="3913505"/>
                     </a:xfrm>
                     <a:prstGeom prst="rect">
                       <a:avLst/>
@@ -15524,16 +15919,124 @@
           <w:sz w:val="32"/>
           <w:u w:val="single"/>
         </w:rPr>
+      </w:r>
+    </w:p>
+    <w:p>
+      <w:pPr>
+        <w:pStyle w:val="Normal"/>
+        <w:bidi w:val="0"/>
+        <w:spacing w:lineRule="exact" w:line="259" w:before="0" w:after="160"/>
+        <w:ind w:hanging="0" w:left="0" w:right="0"/>
+        <w:jc w:val="left"/>
+        <w:rPr>
+          <w:rFonts w:ascii="Times New Roman" w:hAnsi="Times New Roman" w:eastAsia="Times New Roman" w:cs="Times New Roman"/>
+          <w:color w:val="000000"/>
+          <w:spacing w:val="0"/>
+          <w:sz w:val="32"/>
+          <w:u w:val="single"/>
+          <w:lang w:val="uk-UA"/>
+        </w:rPr>
+      </w:pPr>
+      <w:r>
+        <w:rPr>
+          <w:rFonts w:eastAsia="Times New Roman" w:cs="Times New Roman" w:ascii="Times New Roman" w:hAnsi="Times New Roman"/>
+          <w:color w:val="000000"/>
+          <w:spacing w:val="0"/>
+          <w:sz w:val="32"/>
+          <w:u w:val="single"/>
+          <w:lang w:val="uk-UA"/>
+        </w:rPr>
+      </w:r>
+    </w:p>
+    <w:p>
+      <w:pPr>
+        <w:pStyle w:val="Normal"/>
+        <w:bidi w:val="0"/>
+        <w:spacing w:lineRule="exact" w:line="259" w:before="0" w:after="160"/>
+        <w:ind w:hanging="0" w:left="0" w:right="0"/>
+        <w:jc w:val="left"/>
+        <w:rPr>
+          <w:rFonts w:ascii="Times New Roman" w:hAnsi="Times New Roman" w:eastAsia="Times New Roman" w:cs="Times New Roman"/>
+          <w:color w:val="000000"/>
+          <w:spacing w:val="0"/>
+          <w:sz w:val="32"/>
+          <w:u w:val="single"/>
+          <w:lang w:val="uk-UA"/>
+        </w:rPr>
+      </w:pPr>
+      <w:r>
+        <w:rPr>
+          <w:rFonts w:eastAsia="Times New Roman" w:cs="Times New Roman" w:ascii="Times New Roman" w:hAnsi="Times New Roman"/>
+          <w:color w:val="000000"/>
+          <w:spacing w:val="0"/>
+          <w:sz w:val="32"/>
+          <w:u w:val="single"/>
+          <w:lang w:val="uk-UA"/>
+        </w:rPr>
+      </w:r>
+    </w:p>
+    <w:p>
+      <w:pPr>
+        <w:pStyle w:val="Normal"/>
+        <w:bidi w:val="0"/>
+        <w:spacing w:lineRule="exact" w:line="259" w:before="0" w:after="160"/>
+        <w:ind w:hanging="0" w:left="0" w:right="0"/>
+        <w:jc w:val="left"/>
+        <w:rPr>
+          <w:rFonts w:ascii="Times New Roman" w:hAnsi="Times New Roman" w:eastAsia="Times New Roman" w:cs="Times New Roman"/>
+          <w:color w:val="000000"/>
+          <w:spacing w:val="0"/>
+          <w:sz w:val="32"/>
+          <w:u w:val="single"/>
+          <w:lang w:val="uk-UA"/>
+        </w:rPr>
+      </w:pPr>
+      <w:r>
+        <w:rPr>
+          <w:rFonts w:eastAsia="Times New Roman" w:cs="Times New Roman" w:ascii="Times New Roman" w:hAnsi="Times New Roman"/>
+          <w:color w:val="000000"/>
+          <w:spacing w:val="0"/>
+          <w:sz w:val="32"/>
+          <w:u w:val="single"/>
+          <w:lang w:val="uk-UA"/>
+        </w:rPr>
+      </w:r>
+    </w:p>
+    <w:p>
+      <w:pPr>
+        <w:pStyle w:val="Normal"/>
+        <w:bidi w:val="0"/>
+        <w:spacing w:lineRule="exact" w:line="259" w:before="0" w:after="160"/>
+        <w:ind w:hanging="0" w:left="0" w:right="0"/>
+        <w:jc w:val="left"/>
+        <w:rPr>
+          <w:rFonts w:ascii="Times New Roman" w:hAnsi="Times New Roman" w:eastAsia="Times New Roman" w:cs="Times New Roman"/>
+          <w:color w:val="000000"/>
+          <w:spacing w:val="0"/>
+          <w:sz w:val="32"/>
+          <w:u w:val="single"/>
+          <w:lang w:val="uk-UA"/>
+        </w:rPr>
+      </w:pPr>
+      <w:r>
+        <w:rPr>
+          <w:rFonts w:eastAsia="Times New Roman" w:cs="Times New Roman" w:ascii="Times New Roman" w:hAnsi="Times New Roman"/>
+          <w:color w:val="000000"/>
+          <w:spacing w:val="0"/>
+          <w:sz w:val="32"/>
+          <w:u w:val="single"/>
+          <w:lang w:val="uk-UA"/>
+        </w:rPr>
         <w:drawing>
-          <wp:anchor behindDoc="0" distT="0" distB="0" distL="0" distR="0" simplePos="0" locked="0" layoutInCell="0" allowOverlap="1" relativeHeight="5">
+          <wp:anchor behindDoc="0" distT="0" distB="0" distL="0" distR="0" simplePos="0" locked="0" layoutInCell="0" allowOverlap="1" relativeHeight="6">
             <wp:simplePos x="0" y="0"/>
             <wp:positionH relativeFrom="column">
               <wp:align>center</wp:align>
             </wp:positionH>
             <wp:positionV relativeFrom="paragraph">
-              <wp:posOffset>635</wp:posOffset>
+              <wp:align>top</wp:align>
             </wp:positionV>
-            <wp:extent cx="5943600" cy="3248660"/>
+            <wp:extent cx="4782185" cy="3952875"/>
             <wp:effectExtent l="0" t="0" r="0" b="0"/>
             <wp:wrapSquare wrapText="largest"/>
             <wp:docPr id="4" name="Зображення4" descr=""/>
@@ -15558,7 +16061,7 @@
                   <pic:spPr bwMode="auto">
                     <a:xfrm>
                       <a:off x="0" y="0"/>
-                      <a:ext cx="5943600" cy="3248660"/>
+                      <a:ext cx="4782185" cy="3952875"/>
                     </a:xfrm>
                     <a:prstGeom prst="rect">
                       <a:avLst/>
@@ -15571,6 +16074,9 @@
           </wp:anchor>
         </w:drawing>
       </w:r>
+      <w:r>
+        <w:br w:type="page"/>
+      </w:r>
     </w:p>
     <w:p>
       <w:pPr>
@@ -15585,267 +16091,6 @@
           <w:spacing w:val="0"/>
           <w:sz w:val="32"/>
           <w:u w:val="single"/>
-        </w:rPr>
-      </w:pPr>
-      <w:r>
-        <w:rPr>
-          <w:rFonts w:eastAsia="Times New Roman" w:cs="Times New Roman" w:ascii="Times New Roman" w:hAnsi="Times New Roman"/>
-          <w:color w:val="000000"/>
-          <w:spacing w:val="0"/>
-          <w:sz w:val="32"/>
-          <w:u w:val="single"/>
-        </w:rPr>
-      </w:r>
-    </w:p>
-    <w:p>
-      <w:pPr>
-        <w:pStyle w:val="Normal"/>
-        <w:bidi w:val="0"/>
-        <w:spacing w:lineRule="exact" w:line="259" w:before="0" w:after="160"/>
-        <w:ind w:hanging="0" w:left="0" w:right="0"/>
-        <w:jc w:val="left"/>
-        <w:rPr>
-          <w:rFonts w:ascii="Times New Roman" w:hAnsi="Times New Roman" w:eastAsia="Times New Roman" w:cs="Times New Roman"/>
-          <w:color w:val="000000"/>
-          <w:spacing w:val="0"/>
-          <w:sz w:val="32"/>
-          <w:u w:val="single"/>
-        </w:rPr>
-      </w:pPr>
-      <w:r>
-        <w:rPr>
-          <w:rFonts w:eastAsia="Times New Roman" w:cs="Times New Roman" w:ascii="Times New Roman" w:hAnsi="Times New Roman"/>
-          <w:color w:val="000000"/>
-          <w:spacing w:val="0"/>
-          <w:sz w:val="32"/>
-          <w:u w:val="single"/>
-        </w:rPr>
-        <w:drawing>
-          <wp:anchor behindDoc="0" distT="0" distB="0" distL="0" distR="0" simplePos="0" locked="0" layoutInCell="0" allowOverlap="1" relativeHeight="6">
-            <wp:simplePos x="0" y="0"/>
-            <wp:positionH relativeFrom="column">
-              <wp:align>center</wp:align>
-            </wp:positionH>
-            <wp:positionV relativeFrom="paragraph">
-              <wp:posOffset>635</wp:posOffset>
-            </wp:positionV>
-            <wp:extent cx="5943600" cy="2872105"/>
-            <wp:effectExtent l="0" t="0" r="0" b="0"/>
-            <wp:wrapSquare wrapText="largest"/>
-            <wp:docPr id="5" name="Зображення6" descr=""/>
-            <wp:cNvGraphicFramePr>
-              <a:graphicFrameLocks xmlns:a="http://schemas.openxmlformats.org/drawingml/2006/main" noChangeAspect="1"/>
-            </wp:cNvGraphicFramePr>
-            <a:graphic xmlns:a="http://schemas.openxmlformats.org/drawingml/2006/main">
-              <a:graphicData uri="http://schemas.openxmlformats.org/drawingml/2006/picture">
-                <pic:pic xmlns:pic="http://schemas.openxmlformats.org/drawingml/2006/picture">
-                  <pic:nvPicPr>
-                    <pic:cNvPr id="5" name="Зображення6" descr=""/>
-                    <pic:cNvPicPr>
-                      <a:picLocks noChangeAspect="1" noChangeArrowheads="1"/>
-                    </pic:cNvPicPr>
-                  </pic:nvPicPr>
-                  <pic:blipFill>
-                    <a:blip r:embed="rId6"/>
-                    <a:stretch>
-                      <a:fillRect/>
-                    </a:stretch>
-                  </pic:blipFill>
-                  <pic:spPr bwMode="auto">
-                    <a:xfrm>
-                      <a:off x="0" y="0"/>
-                      <a:ext cx="5943600" cy="2872105"/>
-                    </a:xfrm>
-                    <a:prstGeom prst="rect">
-                      <a:avLst/>
-                    </a:prstGeom>
-                    <a:noFill/>
-                  </pic:spPr>
-                </pic:pic>
-              </a:graphicData>
-            </a:graphic>
-          </wp:anchor>
-        </w:drawing>
-      </w:r>
-    </w:p>
-    <w:p>
-      <w:pPr>
-        <w:pStyle w:val="Normal"/>
-        <w:bidi w:val="0"/>
-        <w:spacing w:lineRule="exact" w:line="259" w:before="0" w:after="160"/>
-        <w:ind w:hanging="0" w:left="0" w:right="0"/>
-        <w:jc w:val="left"/>
-        <w:rPr>
-          <w:rFonts w:ascii="Times New Roman" w:hAnsi="Times New Roman" w:eastAsia="Times New Roman" w:cs="Times New Roman"/>
-          <w:color w:val="000000"/>
-          <w:spacing w:val="0"/>
-          <w:sz w:val="32"/>
-          <w:u w:val="single"/>
-        </w:rPr>
-      </w:pPr>
-      <w:r>
-        <w:rPr>
-          <w:rFonts w:eastAsia="Times New Roman" w:cs="Times New Roman" w:ascii="Times New Roman" w:hAnsi="Times New Roman"/>
-          <w:color w:val="000000"/>
-          <w:spacing w:val="0"/>
-          <w:sz w:val="32"/>
-          <w:u w:val="single"/>
-        </w:rPr>
-      </w:r>
-    </w:p>
-    <w:p>
-      <w:pPr>
-        <w:pStyle w:val="Normal"/>
-        <w:bidi w:val="0"/>
-        <w:spacing w:lineRule="exact" w:line="259" w:before="0" w:after="160"/>
-        <w:ind w:hanging="0" w:left="0" w:right="0"/>
-        <w:jc w:val="left"/>
-        <w:rPr>
-          <w:rFonts w:ascii="Times New Roman" w:hAnsi="Times New Roman" w:eastAsia="Times New Roman" w:cs="Times New Roman"/>
-          <w:color w:val="000000"/>
-          <w:spacing w:val="0"/>
-          <w:sz w:val="32"/>
-          <w:u w:val="single"/>
-          <w:lang w:val="uk-UA"/>
-        </w:rPr>
-      </w:pPr>
-      <w:r>
-        <w:rPr>
-          <w:rFonts w:eastAsia="Times New Roman" w:cs="Times New Roman" w:ascii="Times New Roman" w:hAnsi="Times New Roman"/>
-          <w:color w:val="000000"/>
-          <w:spacing w:val="0"/>
-          <w:sz w:val="32"/>
-          <w:u w:val="single"/>
-          <w:lang w:val="uk-UA"/>
-        </w:rPr>
-      </w:r>
-    </w:p>
-    <w:p>
-      <w:pPr>
-        <w:pStyle w:val="Normal"/>
-        <w:bidi w:val="0"/>
-        <w:spacing w:lineRule="exact" w:line="259" w:before="0" w:after="160"/>
-        <w:ind w:hanging="0" w:left="0" w:right="0"/>
-        <w:jc w:val="left"/>
-        <w:rPr>
-          <w:rFonts w:ascii="Times New Roman" w:hAnsi="Times New Roman" w:eastAsia="Times New Roman" w:cs="Times New Roman"/>
-          <w:color w:val="000000"/>
-          <w:spacing w:val="0"/>
-          <w:sz w:val="32"/>
-          <w:u w:val="single"/>
-          <w:lang w:val="uk-UA"/>
-        </w:rPr>
-      </w:pPr>
-      <w:r>
-        <w:rPr>
-          <w:rFonts w:eastAsia="Times New Roman" w:cs="Times New Roman" w:ascii="Times New Roman" w:hAnsi="Times New Roman"/>
-          <w:color w:val="000000"/>
-          <w:spacing w:val="0"/>
-          <w:sz w:val="32"/>
-          <w:u w:val="single"/>
-          <w:lang w:val="uk-UA"/>
-        </w:rPr>
-      </w:r>
-    </w:p>
-    <w:p>
-      <w:pPr>
-        <w:pStyle w:val="Normal"/>
-        <w:bidi w:val="0"/>
-        <w:spacing w:lineRule="exact" w:line="259" w:before="0" w:after="160"/>
-        <w:ind w:hanging="0" w:left="0" w:right="0"/>
-        <w:jc w:val="left"/>
-        <w:rPr>
-          <w:rFonts w:ascii="Times New Roman" w:hAnsi="Times New Roman" w:eastAsia="Times New Roman" w:cs="Times New Roman"/>
-          <w:color w:val="000000"/>
-          <w:spacing w:val="0"/>
-          <w:sz w:val="32"/>
-          <w:u w:val="single"/>
-          <w:lang w:val="uk-UA"/>
-        </w:rPr>
-      </w:pPr>
-      <w:r>
-        <w:rPr>
-          <w:rFonts w:eastAsia="Times New Roman" w:cs="Times New Roman" w:ascii="Times New Roman" w:hAnsi="Times New Roman"/>
-          <w:color w:val="000000"/>
-          <w:spacing w:val="0"/>
-          <w:sz w:val="32"/>
-          <w:u w:val="single"/>
-          <w:lang w:val="uk-UA"/>
-        </w:rPr>
-      </w:r>
-    </w:p>
-    <w:p>
-      <w:pPr>
-        <w:pStyle w:val="Normal"/>
-        <w:bidi w:val="0"/>
-        <w:spacing w:lineRule="exact" w:line="259" w:before="0" w:after="160"/>
-        <w:ind w:hanging="0" w:left="0" w:right="0"/>
-        <w:jc w:val="left"/>
-        <w:rPr>
-          <w:rFonts w:ascii="Times New Roman" w:hAnsi="Times New Roman" w:eastAsia="Times New Roman" w:cs="Times New Roman"/>
-          <w:color w:val="000000"/>
-          <w:spacing w:val="0"/>
-          <w:sz w:val="32"/>
-          <w:u w:val="single"/>
-          <w:lang w:val="uk-UA"/>
-        </w:rPr>
-      </w:pPr>
-      <w:r>
-        <w:rPr>
-          <w:rFonts w:eastAsia="Times New Roman" w:cs="Times New Roman" w:ascii="Times New Roman" w:hAnsi="Times New Roman"/>
-          <w:color w:val="000000"/>
-          <w:spacing w:val="0"/>
-          <w:sz w:val="32"/>
-          <w:u w:val="single"/>
-          <w:lang w:val="uk-UA"/>
-        </w:rPr>
-      </w:r>
-      <w:r>
-        <w:br w:type="page"/>
-      </w:r>
-    </w:p>
-    <w:p>
-      <w:pPr>
-        <w:pStyle w:val="Normal"/>
-        <w:bidi w:val="0"/>
-        <w:spacing w:lineRule="exact" w:line="259" w:before="0" w:after="160"/>
-        <w:ind w:hanging="0" w:left="0" w:right="0"/>
-        <w:jc w:val="left"/>
-        <w:rPr>
-          <w:rFonts w:ascii="Times New Roman" w:hAnsi="Times New Roman" w:eastAsia="Times New Roman" w:cs="Times New Roman"/>
-          <w:color w:val="000000"/>
-          <w:spacing w:val="0"/>
-          <w:sz w:val="32"/>
-          <w:u w:val="single"/>
-        </w:rPr>
-      </w:pPr>
-      <w:r>
-        <w:rPr>
-          <w:rFonts w:eastAsia="Times New Roman" w:cs="Times New Roman" w:ascii="Times New Roman" w:hAnsi="Times New Roman"/>
-          <w:color w:val="000000"/>
-          <w:spacing w:val="0"/>
-          <w:sz w:val="32"/>
-          <w:u w:val="single"/>
-        </w:rPr>
-      </w:r>
-      <w:r>
-        <w:br w:type="page"/>
-      </w:r>
-    </w:p>
-    <w:p>
-      <w:pPr>
-        <w:pStyle w:val="Normal"/>
-        <w:bidi w:val="0"/>
-        <w:spacing w:lineRule="exact" w:line="259" w:before="0" w:after="160"/>
-        <w:ind w:hanging="0" w:left="0" w:right="0"/>
-        <w:jc w:val="left"/>
-        <w:rPr>
-          <w:rFonts w:ascii="Times New Roman" w:hAnsi="Times New Roman" w:eastAsia="Times New Roman" w:cs="Times New Roman"/>
-          <w:color w:val="000000"/>
-          <w:spacing w:val="0"/>
-          <w:sz w:val="32"/>
-          <w:u w:val="none"/>
-          <w:shd w:fill="auto" w:val="clear"/>
         </w:rPr>
       </w:pPr>
       <w:r>
@@ -15955,9 +16200,11 @@
         </w:rPr>
       </w:pPr>
       <w:r>
-        <w:rPr/>
+        <w:rPr>
+          <w:color w:val="000000"/>
+        </w:rPr>
         <w:drawing>
-          <wp:anchor behindDoc="0" distT="0" distB="0" distL="0" distR="0" simplePos="0" locked="0" layoutInCell="0" allowOverlap="1" relativeHeight="7">
+          <wp:anchor behindDoc="0" distT="0" distB="0" distL="0" distR="0" simplePos="0" locked="0" layoutInCell="0" allowOverlap="1" relativeHeight="2">
             <wp:simplePos x="0" y="0"/>
             <wp:positionH relativeFrom="column">
               <wp:align>center</wp:align>
@@ -15968,7 +16215,7 @@
             <wp:extent cx="5943600" cy="5322570"/>
             <wp:effectExtent l="0" t="0" r="0" b="0"/>
             <wp:wrapSquare wrapText="largest"/>
-            <wp:docPr id="6" name="Зображення5" descr=""/>
+            <wp:docPr id="5" name="Зображення5" descr=""/>
             <wp:cNvGraphicFramePr>
               <a:graphicFrameLocks xmlns:a="http://schemas.openxmlformats.org/drawingml/2006/main" noChangeAspect="1"/>
             </wp:cNvGraphicFramePr>
@@ -15976,13 +16223,13 @@
               <a:graphicData uri="http://schemas.openxmlformats.org/drawingml/2006/picture">
                 <pic:pic xmlns:pic="http://schemas.openxmlformats.org/drawingml/2006/picture">
                   <pic:nvPicPr>
-                    <pic:cNvPr id="6" name="Зображення5" descr=""/>
+                    <pic:cNvPr id="5" name="Зображення5" descr=""/>
                     <pic:cNvPicPr>
                       <a:picLocks noChangeAspect="1" noChangeArrowheads="1"/>
                     </pic:cNvPicPr>
                   </pic:nvPicPr>
                   <pic:blipFill>
-                    <a:blip r:embed="rId7"/>
+                    <a:blip r:embed="rId6"/>
                     <a:stretch>
                       <a:fillRect/>
                     </a:stretch>
@@ -16133,8 +16380,8 @@
       <w:r>
         <w:rPr>
           <w:color w:val="000000"/>
-          <w:sz w:val="26"/>
-          <w:szCs w:val="26"/>
+          <w:sz w:val="24"/>
+          <w:szCs w:val="24"/>
           <w:lang w:val="ru-RU"/>
         </w:rPr>
         <w:t>вміння</w:t>
@@ -16142,16 +16389,16 @@
       <w:r>
         <w:rPr>
           <w:color w:val="000000"/>
-          <w:sz w:val="26"/>
-          <w:szCs w:val="26"/>
+          <w:sz w:val="24"/>
+          <w:szCs w:val="24"/>
         </w:rPr>
         <w:t xml:space="preserve"> та навички використовувати інкапсуляцію, абстракцію типів, успадкування та поліморфізм на основі класів, </w:t>
       </w:r>
       <w:r>
         <w:rPr>
           <w:color w:val="000000"/>
-          <w:sz w:val="26"/>
-          <w:szCs w:val="26"/>
+          <w:sz w:val="24"/>
+          <w:szCs w:val="24"/>
           <w:lang w:val="uk-UA"/>
         </w:rPr>
         <w:t xml:space="preserve">до графічного редактору додано зручний копристувацький інтерфейс у вигляді меню бару та </w:t>
@@ -16159,8 +16406,8 @@
       <w:r>
         <w:rPr>
           <w:color w:val="000000"/>
-          <w:sz w:val="26"/>
-          <w:szCs w:val="26"/>
+          <w:sz w:val="24"/>
+          <w:szCs w:val="24"/>
           <w:lang w:val="en-US"/>
         </w:rPr>
         <w:t xml:space="preserve">tool </w:t>
@@ -16168,8 +16415,8 @@
       <w:r>
         <w:rPr>
           <w:color w:val="000000"/>
-          <w:sz w:val="26"/>
-          <w:szCs w:val="26"/>
+          <w:sz w:val="24"/>
+          <w:szCs w:val="24"/>
           <w:lang w:val="ru-RU"/>
         </w:rPr>
         <w:t xml:space="preserve"> бару, </w:t>
@@ -16177,8 +16424,8 @@
       <w:r>
         <w:rPr>
           <w:color w:val="000000"/>
-          <w:sz w:val="26"/>
-          <w:szCs w:val="26"/>
+          <w:sz w:val="24"/>
+          <w:szCs w:val="24"/>
           <w:lang w:val="uk-UA"/>
         </w:rPr>
         <w:t xml:space="preserve">холст для малювання зроблено окремим класом </w:t>
@@ -16186,8 +16433,8 @@
       <w:r>
         <w:rPr>
           <w:color w:val="000000"/>
-          <w:sz w:val="26"/>
-          <w:szCs w:val="26"/>
+          <w:sz w:val="24"/>
+          <w:szCs w:val="24"/>
           <w:lang w:val="en-US"/>
         </w:rPr>
         <w:t xml:space="preserve">mainwidget, </w:t>
@@ -16195,8 +16442,8 @@
       <w:r>
         <w:rPr>
           <w:color w:val="000000"/>
-          <w:sz w:val="26"/>
-          <w:szCs w:val="26"/>
+          <w:sz w:val="24"/>
+          <w:szCs w:val="24"/>
           <w:lang w:val="ru-RU"/>
         </w:rPr>
         <w:t xml:space="preserve">який </w:t>
@@ -16204,26 +16451,17 @@
       <w:r>
         <w:rPr>
           <w:color w:val="000000"/>
-          <w:sz w:val="26"/>
-          <w:szCs w:val="26"/>
+          <w:sz w:val="24"/>
+          <w:szCs w:val="24"/>
           <w:lang w:val="uk-UA"/>
         </w:rPr>
-        <w:t xml:space="preserve">містить колбеки на різні повідомлення від миші, </w:t>
-      </w:r>
-      <w:r>
-        <w:rPr>
-          <w:color w:val="000000"/>
-          <w:sz w:val="26"/>
-          <w:szCs w:val="26"/>
-          <w:lang w:val="uk-UA"/>
-        </w:rPr>
-        <w:t xml:space="preserve">також  додано колбеки, які реагують на сигнали, які спрацьовують в залежності від дій користувача з інтерфейсом </w:t>
-      </w:r>
-      <w:r>
-        <w:rPr>
-          <w:color w:val="000000"/>
-          <w:sz w:val="26"/>
-          <w:szCs w:val="26"/>
+        <w:t xml:space="preserve">містить колбеки на різні повідомлення від миші, також  додано колбеки, які реагують на сигнали, які спрацьовують в залежності від дій користувача з інтерфейсом </w:t>
+      </w:r>
+      <w:r>
+        <w:rPr>
+          <w:color w:val="000000"/>
+          <w:sz w:val="24"/>
+          <w:szCs w:val="24"/>
           <w:lang w:val="en-US"/>
         </w:rPr>
         <w:t xml:space="preserve">tool </w:t>
@@ -16231,8 +16469,8 @@
       <w:r>
         <w:rPr>
           <w:color w:val="000000"/>
-          <w:sz w:val="26"/>
-          <w:szCs w:val="26"/>
+          <w:sz w:val="24"/>
+          <w:szCs w:val="24"/>
           <w:lang w:val="ru-RU"/>
         </w:rPr>
         <w:t>бару та меню бару.</w:t>
@@ -16403,9 +16641,10 @@
       </w:r>
     </w:p>
     <w:sectPr>
+      <w:footerReference w:type="default" r:id="rId7"/>
       <w:type w:val="nextPage"/>
       <w:pgSz w:w="12240" w:h="15840"/>
-      <w:pgMar w:left="1440" w:right="1440" w:gutter="0" w:header="0" w:top="1440" w:footer="0" w:bottom="1440"/>
+      <w:pgMar w:left="1440" w:right="1440" w:gutter="0" w:header="0" w:top="1440" w:footer="1440" w:bottom="1992"/>
       <w:pgNumType w:fmt="decimal"/>
       <w:formProt w:val="false"/>
       <w:textDirection w:val="lrTb"/>
@@ -16413,6 +16652,20 @@
     </w:sectPr>
   </w:body>
 </w:document>
+</file>
+
+<file path=word/footer1.xml><?xml version="1.0" encoding="utf-8"?>
+<w:ftr xmlns:o="urn:schemas-microsoft-com:office:office" xmlns:r="http://schemas.openxmlformats.org/officeDocument/2006/relationships" xmlns:v="urn:schemas-microsoft-com:vml" xmlns:w="http://schemas.openxmlformats.org/wordprocessingml/2006/main" xmlns:w10="urn:schemas-microsoft-com:office:word" xmlns:wp="http://schemas.openxmlformats.org/drawingml/2006/wordprocessingDrawing" xmlns:pic="http://schemas.openxmlformats.org/drawingml/2006/picture" xmlns:wps="http://schemas.microsoft.com/office/word/2010/wordprocessingShape" xmlns:wpg="http://schemas.microsoft.com/office/word/2010/wordprocessingGroup" xmlns:mc="http://schemas.openxmlformats.org/markup-compatibility/2006" xmlns:wp14="http://schemas.microsoft.com/office/word/2010/wordprocessingDrawing" xmlns:w14="http://schemas.microsoft.com/office/word/2010/wordml" xmlns:w15="http://schemas.microsoft.com/office/word/2012/wordml" mc:Ignorable="w14 wp14 w15">
+  <w:p>
+    <w:pPr>
+      <w:pStyle w:val="Footer"/>
+      <w:rPr/>
+    </w:pPr>
+    <w:r>
+      <w:rPr/>
+    </w:r>
+  </w:p>
+</w:ftr>
 </file>
 
 <file path=word/styles.xml><?xml version="1.0" encoding="utf-8"?>
@@ -16549,6 +16802,28 @@
       <w:color w:val="FFFFFF"/>
     </w:rPr>
   </w:style>
+  <w:style w:type="paragraph" w:styleId="Style16">
+    <w:name w:val="Верхній і нижній колонтитули"/>
+    <w:basedOn w:val="Normal"/>
+    <w:qFormat/>
+    <w:pPr>
+      <w:suppressLineNumbers/>
+      <w:tabs>
+        <w:tab w:val="clear" w:pos="709"/>
+        <w:tab w:val="center" w:pos="4680" w:leader="none"/>
+        <w:tab w:val="right" w:pos="9360" w:leader="none"/>
+      </w:tabs>
+    </w:pPr>
+    <w:rPr/>
+  </w:style>
+  <w:style w:type="paragraph" w:styleId="Footer">
+    <w:name w:val="footer"/>
+    <w:basedOn w:val="Style16"/>
+    <w:pPr>
+      <w:suppressLineNumbers/>
+    </w:pPr>
+    <w:rPr/>
+  </w:style>
 </w:styles>
 </file>
 

</xml_diff>